<commit_message>
docs(compliance): finalise approval pack review
</commit_message>
<xml_diff>
--- a/docs/au-bank-insurance-platform/rule-packs/approval/1-Decision-Pack.docx
+++ b/docs/au-bank-insurance-platform/rule-packs/approval/1-Decision-Pack.docx
@@ -365,6 +365,32 @@
               <w:t xml:space="preserve">The three volumes are one submission and should be read together.</w:t>
             </w:r>
           </w:p>
+          <w:p>
+            <w:r>
+              <w:t xml:space="preserve">Open companion files: </w:t>
+            </w:r>
+            <w:hyperlink r:id="rId10">
+              <w:r>
+                <w:rPr>
+                  <w:color w:val="0563C1"/>
+                  <w:u w:val="single"/>
+                </w:rPr>
+                <w:t>Volume 2 — Consent Rule Pack</w:t>
+              </w:r>
+            </w:hyperlink>
+            <w:r>
+              <w:t xml:space="preserve">  |  </w:t>
+            </w:r>
+            <w:hyperlink r:id="rId11">
+              <w:r>
+                <w:rPr>
+                  <w:color w:val="0563C1"/>
+                  <w:u w:val="single"/>
+                </w:rPr>
+                <w:t>Volume 3 — Suitability Rule Pack</w:t>
+              </w:r>
+            </w:hyperlink>
+          </w:p>
         </w:tc>
       </w:tr>
       <w:tr>
@@ -1095,7 +1121,7 @@
                 <w:sz w:val="18"/>
                 <w:szCs w:val="18"/>
               </w:rPr>
-              <w:t xml:space="preserve">The first release — Life products (Term, Savings/Endowment and unit-linked), sold to existing bank customers, assisted by a relationship manager, through the approved insurer panel</w:t>
+              <w:t>R0 execution — one Term Life sale to an existing bank customer, assisted by a relationship manager, through one Group A insurer on the approved panel. The suitability model also covers Savings/Endowment and unit-linked classes for later governed releases; approving the model does not move those classes into R0.</w:t>
             </w:r>
           </w:p>
         </w:tc>
@@ -1160,19 +1186,18 @@
                 <w:sz w:val="18"/>
                 <w:szCs w:val="18"/>
               </w:rPr>
-              <w:t xml:space="preserve">Yes, as a set of three. </w:t>
-            </w:r>
-            <w:r>
-              <w:rPr>
-                <w:b w:val="false"/>
-                <w:bCs w:val="false"/>
-                <w:i w:val="false"/>
-                <w:iCs w:val="false"/>
-                <w:color w:val="222629"/>
-                <w:sz w:val="18"/>
-                <w:szCs w:val="18"/>
-              </w:rPr>
-              <w:t xml:space="preserve">Every rule submitted for approval is reproduced in full in Volumes 2 and 3. Nothing outside these three documents needs to be obtained.</w:t>
+              <w:t>Yes for review of the proposed business behaviour, as a set of three. Every submitted rule is reproduced in Volumes 2 and 3. A conclusion on regulatory permissibility additionally requires Compliance to complete §6 with authoritative sources and applicability determinations; unresolved rows route to Shailja S with Legal support.</w:t>
+            </w:r>
+            <w:r>
+              <w:rPr>
+                <w:b w:val="false"/>
+                <w:bCs w:val="false"/>
+                <w:i w:val="false"/>
+                <w:iCs w:val="false"/>
+                <w:color w:val="222629"/>
+                <w:sz w:val="18"/>
+                <w:szCs w:val="18"/>
+              </w:rPr>
             </w:r>
           </w:p>
         </w:tc>
@@ -1311,6 +1336,7 @@
       </w:tr>
     </w:tbl>
     <w:p>
+      <w:bookmarkStart w:id="1" w:name="toc"/>
       <w:pPr>
         <w:pStyle w:val="Heading1"/>
         <w:keepNext/>
@@ -1331,456 +1357,547 @@
         </w:rPr>
         <w:t xml:space="preserve">Contents</w:t>
       </w:r>
+      <w:bookmarkEnd w:id="1"/>
     </w:p>
     <w:p>
       <w:pPr>
         <w:spacing w:after="70" w:before="0" w:line="276"/>
         <w:jc w:val="left"/>
       </w:pPr>
-      <w:r>
-        <w:rPr>
-          <w:b/>
-          <w:bCs/>
-          <w:i w:val="false"/>
-          <w:iCs w:val="false"/>
-          <w:color w:val="0F6E6E"/>
-          <w:sz w:val="20"/>
-          <w:szCs w:val="20"/>
-        </w:rPr>
-        <w:t xml:space="preserve">1.  </w:t>
-      </w:r>
-      <w:r>
-        <w:rPr>
-          <w:b w:val="false"/>
-          <w:bCs w:val="false"/>
-          <w:i w:val="false"/>
-          <w:iCs w:val="false"/>
-          <w:color w:val="222629"/>
-          <w:sz w:val="20"/>
-          <w:szCs w:val="20"/>
-        </w:rPr>
-        <w:t xml:space="preserve">What Compliance is being asked to approve</w:t>
-      </w:r>
+      <w:hyperlink w:anchor="sec_003" w:history="1">
+        <w:r>
+          <w:rPr>
+            <w:b/>
+            <w:bCs/>
+            <w:i w:val="false"/>
+            <w:iCs w:val="false"/>
+            <w:color w:val="0F6E6E"/>
+            <w:sz w:val="20"/>
+            <w:szCs w:val="20"/>
+            <w:color w:val="0563C1"/>
+            <w:u w:val="single"/>
+          </w:rPr>
+          <w:t xml:space="preserve">1.  </w:t>
+        </w:r>
+        <w:r>
+          <w:rPr>
+            <w:b w:val="false"/>
+            <w:bCs w:val="false"/>
+            <w:i w:val="false"/>
+            <w:iCs w:val="false"/>
+            <w:color w:val="222629"/>
+            <w:sz w:val="20"/>
+            <w:szCs w:val="20"/>
+            <w:color w:val="0563C1"/>
+            <w:u w:val="single"/>
+          </w:rPr>
+          <w:t xml:space="preserve">What Compliance is being asked to approve</w:t>
+        </w:r>
+      </w:hyperlink>
     </w:p>
     <w:p>
       <w:pPr>
         <w:spacing w:after="70" w:before="0" w:line="276"/>
         <w:jc w:val="left"/>
       </w:pPr>
-      <w:r>
-        <w:rPr>
-          <w:b/>
-          <w:bCs/>
-          <w:i w:val="false"/>
-          <w:iCs w:val="false"/>
-          <w:color w:val="0F6E6E"/>
-          <w:sz w:val="20"/>
-          <w:szCs w:val="20"/>
-        </w:rPr>
-        <w:t xml:space="preserve">2.  </w:t>
-      </w:r>
-      <w:r>
-        <w:rPr>
-          <w:b w:val="false"/>
-          <w:bCs w:val="false"/>
-          <w:i w:val="false"/>
-          <w:iCs w:val="false"/>
-          <w:color w:val="222629"/>
-          <w:sz w:val="20"/>
-          <w:szCs w:val="20"/>
-        </w:rPr>
-        <w:t xml:space="preserve">Executive summary</w:t>
-      </w:r>
+      <w:hyperlink w:anchor="sec_004" w:history="1">
+        <w:r>
+          <w:rPr>
+            <w:b/>
+            <w:bCs/>
+            <w:i w:val="false"/>
+            <w:iCs w:val="false"/>
+            <w:color w:val="0F6E6E"/>
+            <w:sz w:val="20"/>
+            <w:szCs w:val="20"/>
+            <w:color w:val="0563C1"/>
+            <w:u w:val="single"/>
+          </w:rPr>
+          <w:t xml:space="preserve">2.  </w:t>
+        </w:r>
+        <w:r>
+          <w:rPr>
+            <w:b w:val="false"/>
+            <w:bCs w:val="false"/>
+            <w:i w:val="false"/>
+            <w:iCs w:val="false"/>
+            <w:color w:val="222629"/>
+            <w:sz w:val="20"/>
+            <w:szCs w:val="20"/>
+            <w:color w:val="0563C1"/>
+            <w:u w:val="single"/>
+          </w:rPr>
+          <w:t xml:space="preserve">Executive summary</w:t>
+        </w:r>
+      </w:hyperlink>
     </w:p>
     <w:p>
       <w:pPr>
         <w:spacing w:after="70" w:before="0" w:line="276"/>
         <w:jc w:val="left"/>
       </w:pPr>
-      <w:r>
-        <w:rPr>
-          <w:b/>
-          <w:bCs/>
-          <w:i w:val="false"/>
-          <w:iCs w:val="false"/>
-          <w:color w:val="0F6E6E"/>
-          <w:sz w:val="20"/>
-          <w:szCs w:val="20"/>
-        </w:rPr>
-        <w:t xml:space="preserve">3.  </w:t>
-      </w:r>
-      <w:r>
-        <w:rPr>
-          <w:b w:val="false"/>
-          <w:bCs w:val="false"/>
-          <w:i w:val="false"/>
-          <w:iCs w:val="false"/>
-          <w:color w:val="222629"/>
-          <w:sz w:val="20"/>
-          <w:szCs w:val="20"/>
-        </w:rPr>
-        <w:t xml:space="preserve">Where this sits — scope, position and authority</w:t>
-      </w:r>
+      <w:hyperlink w:anchor="sec_007" w:history="1">
+        <w:r>
+          <w:rPr>
+            <w:b/>
+            <w:bCs/>
+            <w:i w:val="false"/>
+            <w:iCs w:val="false"/>
+            <w:color w:val="0F6E6E"/>
+            <w:sz w:val="20"/>
+            <w:szCs w:val="20"/>
+            <w:color w:val="0563C1"/>
+            <w:u w:val="single"/>
+          </w:rPr>
+          <w:t xml:space="preserve">3.  </w:t>
+        </w:r>
+        <w:r>
+          <w:rPr>
+            <w:b w:val="false"/>
+            <w:bCs w:val="false"/>
+            <w:i w:val="false"/>
+            <w:iCs w:val="false"/>
+            <w:color w:val="222629"/>
+            <w:sz w:val="20"/>
+            <w:szCs w:val="20"/>
+            <w:color w:val="0563C1"/>
+            <w:u w:val="single"/>
+          </w:rPr>
+          <w:t xml:space="preserve">Where this sits — scope, position and authority</w:t>
+        </w:r>
+      </w:hyperlink>
     </w:p>
     <w:p>
       <w:pPr>
         <w:spacing w:after="70" w:before="0" w:line="276"/>
         <w:jc w:val="left"/>
       </w:pPr>
-      <w:r>
-        <w:rPr>
-          <w:b/>
-          <w:bCs/>
-          <w:i w:val="false"/>
-          <w:iCs w:val="false"/>
-          <w:color w:val="0F6E6E"/>
-          <w:sz w:val="20"/>
-          <w:szCs w:val="20"/>
-        </w:rPr>
-        <w:t xml:space="preserve">4.  </w:t>
-      </w:r>
-      <w:r>
-        <w:rPr>
-          <w:b w:val="false"/>
-          <w:bCs w:val="false"/>
-          <w:i w:val="false"/>
-          <w:iCs w:val="false"/>
-          <w:color w:val="222629"/>
-          <w:sz w:val="20"/>
-          <w:szCs w:val="20"/>
-        </w:rPr>
-        <w:t xml:space="preserve">What is submitted</w:t>
-      </w:r>
+      <w:hyperlink w:anchor="sec_012" w:history="1">
+        <w:r>
+          <w:rPr>
+            <w:b/>
+            <w:bCs/>
+            <w:i w:val="false"/>
+            <w:iCs w:val="false"/>
+            <w:color w:val="0F6E6E"/>
+            <w:sz w:val="20"/>
+            <w:szCs w:val="20"/>
+            <w:color w:val="0563C1"/>
+            <w:u w:val="single"/>
+          </w:rPr>
+          <w:t xml:space="preserve">4.  </w:t>
+        </w:r>
+        <w:r>
+          <w:rPr>
+            <w:b w:val="false"/>
+            <w:bCs w:val="false"/>
+            <w:i w:val="false"/>
+            <w:iCs w:val="false"/>
+            <w:color w:val="222629"/>
+            <w:sz w:val="20"/>
+            <w:szCs w:val="20"/>
+            <w:color w:val="0563C1"/>
+            <w:u w:val="single"/>
+          </w:rPr>
+          <w:t xml:space="preserve">What is submitted</w:t>
+        </w:r>
+      </w:hyperlink>
     </w:p>
     <w:p>
       <w:pPr>
         <w:spacing w:after="70" w:before="0" w:line="276"/>
         <w:jc w:val="left"/>
       </w:pPr>
-      <w:r>
-        <w:rPr>
-          <w:b/>
-          <w:bCs/>
-          <w:i w:val="false"/>
-          <w:iCs w:val="false"/>
-          <w:color w:val="0F6E6E"/>
-          <w:sz w:val="20"/>
-          <w:szCs w:val="20"/>
-        </w:rPr>
-        <w:t xml:space="preserve">5.  </w:t>
-      </w:r>
-      <w:r>
-        <w:rPr>
-          <w:b w:val="false"/>
-          <w:bCs w:val="false"/>
-          <w:i w:val="false"/>
-          <w:iCs w:val="false"/>
-          <w:color w:val="222629"/>
-          <w:sz w:val="20"/>
-          <w:szCs w:val="20"/>
-        </w:rPr>
-        <w:t xml:space="preserve">Why a signature, and what it certifies</w:t>
-      </w:r>
+      <w:hyperlink w:anchor="sec_014" w:history="1">
+        <w:r>
+          <w:rPr>
+            <w:b/>
+            <w:bCs/>
+            <w:i w:val="false"/>
+            <w:iCs w:val="false"/>
+            <w:color w:val="0F6E6E"/>
+            <w:sz w:val="20"/>
+            <w:szCs w:val="20"/>
+            <w:color w:val="0563C1"/>
+            <w:u w:val="single"/>
+          </w:rPr>
+          <w:t xml:space="preserve">5.  </w:t>
+        </w:r>
+        <w:r>
+          <w:rPr>
+            <w:b w:val="false"/>
+            <w:bCs w:val="false"/>
+            <w:i w:val="false"/>
+            <w:iCs w:val="false"/>
+            <w:color w:val="222629"/>
+            <w:sz w:val="20"/>
+            <w:szCs w:val="20"/>
+            <w:color w:val="0563C1"/>
+            <w:u w:val="single"/>
+          </w:rPr>
+          <w:t xml:space="preserve">Why a signature, and what it certifies</w:t>
+        </w:r>
+      </w:hyperlink>
     </w:p>
     <w:p>
       <w:pPr>
         <w:spacing w:after="70" w:before="0" w:line="276"/>
         <w:jc w:val="left"/>
       </w:pPr>
-      <w:r>
-        <w:rPr>
-          <w:b/>
-          <w:bCs/>
-          <w:i w:val="false"/>
-          <w:iCs w:val="false"/>
-          <w:color w:val="0F6E6E"/>
-          <w:sz w:val="20"/>
-          <w:szCs w:val="20"/>
-        </w:rPr>
-        <w:t xml:space="preserve">6.  </w:t>
-      </w:r>
-      <w:r>
-        <w:rPr>
-          <w:b w:val="false"/>
-          <w:bCs w:val="false"/>
-          <w:i w:val="false"/>
-          <w:iCs w:val="false"/>
-          <w:color w:val="222629"/>
-          <w:sz w:val="20"/>
-          <w:szCs w:val="20"/>
-        </w:rPr>
-        <w:t xml:space="preserve">Regulatory basis and applicability</w:t>
-      </w:r>
+      <w:hyperlink w:anchor="sec_015" w:history="1">
+        <w:r>
+          <w:rPr>
+            <w:b/>
+            <w:bCs/>
+            <w:i w:val="false"/>
+            <w:iCs w:val="false"/>
+            <w:color w:val="0F6E6E"/>
+            <w:sz w:val="20"/>
+            <w:szCs w:val="20"/>
+            <w:color w:val="0563C1"/>
+            <w:u w:val="single"/>
+          </w:rPr>
+          <w:t xml:space="preserve">6.  </w:t>
+        </w:r>
+        <w:r>
+          <w:rPr>
+            <w:b w:val="false"/>
+            <w:bCs w:val="false"/>
+            <w:i w:val="false"/>
+            <w:iCs w:val="false"/>
+            <w:color w:val="222629"/>
+            <w:sz w:val="20"/>
+            <w:szCs w:val="20"/>
+            <w:color w:val="0563C1"/>
+            <w:u w:val="single"/>
+          </w:rPr>
+          <w:t xml:space="preserve">Regulatory basis and applicability</w:t>
+        </w:r>
+      </w:hyperlink>
     </w:p>
     <w:p>
       <w:pPr>
         <w:spacing w:after="70" w:before="0" w:line="276"/>
         <w:jc w:val="left"/>
       </w:pPr>
-      <w:r>
-        <w:rPr>
-          <w:b/>
-          <w:bCs/>
-          <w:i w:val="false"/>
-          <w:iCs w:val="false"/>
-          <w:color w:val="0F6E6E"/>
-          <w:sz w:val="20"/>
-          <w:szCs w:val="20"/>
-        </w:rPr>
-        <w:t xml:space="preserve">7.  </w:t>
-      </w:r>
-      <w:r>
-        <w:rPr>
-          <w:b w:val="false"/>
-          <w:bCs w:val="false"/>
-          <w:i w:val="false"/>
-          <w:iCs w:val="false"/>
-          <w:color w:val="222629"/>
-          <w:sz w:val="20"/>
-          <w:szCs w:val="20"/>
-        </w:rPr>
-        <w:t xml:space="preserve">How to read this document</w:t>
-      </w:r>
+      <w:hyperlink w:anchor="sec_020" w:history="1">
+        <w:r>
+          <w:rPr>
+            <w:b/>
+            <w:bCs/>
+            <w:i w:val="false"/>
+            <w:iCs w:val="false"/>
+            <w:color w:val="0F6E6E"/>
+            <w:sz w:val="20"/>
+            <w:szCs w:val="20"/>
+            <w:color w:val="0563C1"/>
+            <w:u w:val="single"/>
+          </w:rPr>
+          <w:t xml:space="preserve">7.  </w:t>
+        </w:r>
+        <w:r>
+          <w:rPr>
+            <w:b w:val="false"/>
+            <w:bCs w:val="false"/>
+            <w:i w:val="false"/>
+            <w:iCs w:val="false"/>
+            <w:color w:val="222629"/>
+            <w:sz w:val="20"/>
+            <w:szCs w:val="20"/>
+            <w:color w:val="0563C1"/>
+            <w:u w:val="single"/>
+          </w:rPr>
+          <w:t xml:space="preserve">How to read this document</w:t>
+        </w:r>
+      </w:hyperlink>
     </w:p>
     <w:p>
       <w:pPr>
         <w:spacing w:after="70" w:before="0" w:line="276"/>
         <w:jc w:val="left"/>
       </w:pPr>
-      <w:r>
-        <w:rPr>
-          <w:b/>
-          <w:bCs/>
-          <w:i w:val="false"/>
-          <w:iCs w:val="false"/>
-          <w:color w:val="0F6E6E"/>
-          <w:sz w:val="20"/>
-          <w:szCs w:val="20"/>
-        </w:rPr>
-        <w:t xml:space="preserve">8.  </w:t>
-      </w:r>
-      <w:r>
-        <w:rPr>
-          <w:b w:val="false"/>
-          <w:bCs w:val="false"/>
-          <w:i w:val="false"/>
-          <w:iCs w:val="false"/>
-          <w:color w:val="222629"/>
-          <w:sz w:val="20"/>
-          <w:szCs w:val="20"/>
-        </w:rPr>
-        <w:t xml:space="preserve">Decision Schedule A — Consent Rule Pack</w:t>
-      </w:r>
+      <w:hyperlink w:anchor="sec_023" w:history="1">
+        <w:r>
+          <w:rPr>
+            <w:b/>
+            <w:bCs/>
+            <w:i w:val="false"/>
+            <w:iCs w:val="false"/>
+            <w:color w:val="0F6E6E"/>
+            <w:sz w:val="20"/>
+            <w:szCs w:val="20"/>
+            <w:color w:val="0563C1"/>
+            <w:u w:val="single"/>
+          </w:rPr>
+          <w:t xml:space="preserve">8.  </w:t>
+        </w:r>
+        <w:r>
+          <w:rPr>
+            <w:b w:val="false"/>
+            <w:bCs w:val="false"/>
+            <w:i w:val="false"/>
+            <w:iCs w:val="false"/>
+            <w:color w:val="222629"/>
+            <w:sz w:val="20"/>
+            <w:szCs w:val="20"/>
+            <w:color w:val="0563C1"/>
+            <w:u w:val="single"/>
+          </w:rPr>
+          <w:t xml:space="preserve">Decision Schedule A — Consent Rule Pack</w:t>
+        </w:r>
+      </w:hyperlink>
     </w:p>
     <w:p>
       <w:pPr>
         <w:spacing w:after="70" w:before="0" w:line="276"/>
         <w:jc w:val="left"/>
       </w:pPr>
-      <w:r>
-        <w:rPr>
-          <w:b/>
-          <w:bCs/>
-          <w:i w:val="false"/>
-          <w:iCs w:val="false"/>
-          <w:color w:val="0F6E6E"/>
-          <w:sz w:val="20"/>
-          <w:szCs w:val="20"/>
-        </w:rPr>
-        <w:t xml:space="preserve">9.  </w:t>
-      </w:r>
-      <w:r>
-        <w:rPr>
-          <w:b w:val="false"/>
-          <w:bCs w:val="false"/>
-          <w:i w:val="false"/>
-          <w:iCs w:val="false"/>
-          <w:color w:val="222629"/>
-          <w:sz w:val="20"/>
-          <w:szCs w:val="20"/>
-        </w:rPr>
-        <w:t xml:space="preserve">Decision Schedule B — Suitability Rule Pack</w:t>
-      </w:r>
+      <w:hyperlink w:anchor="sec_024" w:history="1">
+        <w:r>
+          <w:rPr>
+            <w:b/>
+            <w:bCs/>
+            <w:i w:val="false"/>
+            <w:iCs w:val="false"/>
+            <w:color w:val="0F6E6E"/>
+            <w:sz w:val="20"/>
+            <w:szCs w:val="20"/>
+            <w:color w:val="0563C1"/>
+            <w:u w:val="single"/>
+          </w:rPr>
+          <w:t xml:space="preserve">9.  </w:t>
+        </w:r>
+        <w:r>
+          <w:rPr>
+            <w:b w:val="false"/>
+            <w:bCs w:val="false"/>
+            <w:i w:val="false"/>
+            <w:iCs w:val="false"/>
+            <w:color w:val="222629"/>
+            <w:sz w:val="20"/>
+            <w:szCs w:val="20"/>
+            <w:color w:val="0563C1"/>
+            <w:u w:val="single"/>
+          </w:rPr>
+          <w:t xml:space="preserve">Decision Schedule B — Suitability Rule Pack</w:t>
+        </w:r>
+      </w:hyperlink>
     </w:p>
     <w:p>
       <w:pPr>
         <w:spacing w:after="70" w:before="0" w:line="276"/>
         <w:jc w:val="left"/>
       </w:pPr>
-      <w:r>
-        <w:rPr>
-          <w:b/>
-          <w:bCs/>
-          <w:i w:val="false"/>
-          <w:iCs w:val="false"/>
-          <w:color w:val="0F6E6E"/>
-          <w:sz w:val="20"/>
-          <w:szCs w:val="20"/>
-        </w:rPr>
-        <w:t xml:space="preserve">10.  </w:t>
-      </w:r>
-      <w:r>
-        <w:rPr>
-          <w:b w:val="false"/>
-          <w:bCs w:val="false"/>
-          <w:i w:val="false"/>
-          <w:iCs w:val="false"/>
-          <w:color w:val="222629"/>
-          <w:sz w:val="20"/>
-          <w:szCs w:val="20"/>
-        </w:rPr>
-        <w:t xml:space="preserve">Open items requiring a Compliance determination</w:t>
-      </w:r>
+      <w:hyperlink w:anchor="sec_025" w:history="1">
+        <w:r>
+          <w:rPr>
+            <w:b/>
+            <w:bCs/>
+            <w:i w:val="false"/>
+            <w:iCs w:val="false"/>
+            <w:color w:val="0F6E6E"/>
+            <w:sz w:val="20"/>
+            <w:szCs w:val="20"/>
+            <w:color w:val="0563C1"/>
+            <w:u w:val="single"/>
+          </w:rPr>
+          <w:t xml:space="preserve">10.  </w:t>
+        </w:r>
+        <w:r>
+          <w:rPr>
+            <w:b w:val="false"/>
+            <w:bCs w:val="false"/>
+            <w:i w:val="false"/>
+            <w:iCs w:val="false"/>
+            <w:color w:val="222629"/>
+            <w:sz w:val="20"/>
+            <w:szCs w:val="20"/>
+            <w:color w:val="0563C1"/>
+            <w:u w:val="single"/>
+          </w:rPr>
+          <w:t xml:space="preserve">Open items requiring a Compliance determination</w:t>
+        </w:r>
+      </w:hyperlink>
     </w:p>
     <w:p>
       <w:pPr>
         <w:spacing w:after="70" w:before="0" w:line="276"/>
         <w:jc w:val="left"/>
       </w:pPr>
-      <w:r>
-        <w:rPr>
-          <w:b/>
-          <w:bCs/>
-          <w:i w:val="false"/>
-          <w:iCs w:val="false"/>
-          <w:color w:val="0F6E6E"/>
-          <w:sz w:val="20"/>
-          <w:szCs w:val="20"/>
-        </w:rPr>
-        <w:t xml:space="preserve">11.  </w:t>
-      </w:r>
-      <w:r>
-        <w:rPr>
-          <w:b w:val="false"/>
-          <w:bCs w:val="false"/>
-          <w:i w:val="false"/>
-          <w:iCs w:val="false"/>
-          <w:color w:val="222629"/>
-          <w:sz w:val="20"/>
-          <w:szCs w:val="20"/>
-        </w:rPr>
-        <w:t xml:space="preserve">Product proposal — consolidating consent into a single up-front ceremony</w:t>
-      </w:r>
+      <w:hyperlink w:anchor="sec_026" w:history="1">
+        <w:r>
+          <w:rPr>
+            <w:b/>
+            <w:bCs/>
+            <w:i w:val="false"/>
+            <w:iCs w:val="false"/>
+            <w:color w:val="0F6E6E"/>
+            <w:sz w:val="20"/>
+            <w:szCs w:val="20"/>
+            <w:color w:val="0563C1"/>
+            <w:u w:val="single"/>
+          </w:rPr>
+          <w:t xml:space="preserve">11.  </w:t>
+        </w:r>
+        <w:r>
+          <w:rPr>
+            <w:b w:val="false"/>
+            <w:bCs w:val="false"/>
+            <w:i w:val="false"/>
+            <w:iCs w:val="false"/>
+            <w:color w:val="222629"/>
+            <w:sz w:val="20"/>
+            <w:szCs w:val="20"/>
+            <w:color w:val="0563C1"/>
+            <w:u w:val="single"/>
+          </w:rPr>
+          <w:t xml:space="preserve">Product proposal — consolidating consent into a single up-front ceremony</w:t>
+        </w:r>
+      </w:hyperlink>
     </w:p>
     <w:p>
       <w:pPr>
         <w:spacing w:after="70" w:before="0" w:line="276"/>
         <w:jc w:val="left"/>
       </w:pPr>
-      <w:r>
-        <w:rPr>
-          <w:b/>
-          <w:bCs/>
-          <w:i w:val="false"/>
-          <w:iCs w:val="false"/>
-          <w:color w:val="0F6E6E"/>
-          <w:sz w:val="20"/>
-          <w:szCs w:val="20"/>
-        </w:rPr>
-        <w:t xml:space="preserve">12.  </w:t>
-      </w:r>
-      <w:r>
-        <w:rPr>
-          <w:b w:val="false"/>
-          <w:bCs w:val="false"/>
-          <w:i w:val="false"/>
-          <w:iCs w:val="false"/>
-          <w:color w:val="222629"/>
-          <w:sz w:val="20"/>
-          <w:szCs w:val="20"/>
-        </w:rPr>
-        <w:t xml:space="preserve">Conditions that carry forward into build and run</w:t>
-      </w:r>
+      <w:hyperlink w:anchor="sec_035" w:history="1">
+        <w:r>
+          <w:rPr>
+            <w:b/>
+            <w:bCs/>
+            <w:i w:val="false"/>
+            <w:iCs w:val="false"/>
+            <w:color w:val="0F6E6E"/>
+            <w:sz w:val="20"/>
+            <w:szCs w:val="20"/>
+            <w:color w:val="0563C1"/>
+            <w:u w:val="single"/>
+          </w:rPr>
+          <w:t xml:space="preserve">12.  </w:t>
+        </w:r>
+        <w:r>
+          <w:rPr>
+            <w:b w:val="false"/>
+            <w:bCs w:val="false"/>
+            <w:i w:val="false"/>
+            <w:iCs w:val="false"/>
+            <w:color w:val="222629"/>
+            <w:sz w:val="20"/>
+            <w:szCs w:val="20"/>
+            <w:color w:val="0563C1"/>
+            <w:u w:val="single"/>
+          </w:rPr>
+          <w:t xml:space="preserve">Conditions that carry forward into build and run</w:t>
+        </w:r>
+      </w:hyperlink>
     </w:p>
     <w:p>
       <w:pPr>
         <w:spacing w:after="70" w:before="0" w:line="276"/>
         <w:jc w:val="left"/>
       </w:pPr>
-      <w:r>
-        <w:rPr>
-          <w:b/>
-          <w:bCs/>
-          <w:i w:val="false"/>
-          <w:iCs w:val="false"/>
-          <w:color w:val="0F6E6E"/>
-          <w:sz w:val="20"/>
-          <w:szCs w:val="20"/>
-        </w:rPr>
-        <w:t xml:space="preserve">13.  </w:t>
-      </w:r>
-      <w:r>
-        <w:rPr>
-          <w:b w:val="false"/>
-          <w:bCs w:val="false"/>
-          <w:i w:val="false"/>
-          <w:iCs w:val="false"/>
-          <w:color w:val="222629"/>
-          <w:sz w:val="20"/>
-          <w:szCs w:val="20"/>
-        </w:rPr>
-        <w:t xml:space="preserve">What happens after approval</w:t>
-      </w:r>
+      <w:hyperlink w:anchor="sec_037" w:history="1">
+        <w:r>
+          <w:rPr>
+            <w:b/>
+            <w:bCs/>
+            <w:i w:val="false"/>
+            <w:iCs w:val="false"/>
+            <w:color w:val="0F6E6E"/>
+            <w:sz w:val="20"/>
+            <w:szCs w:val="20"/>
+            <w:color w:val="0563C1"/>
+            <w:u w:val="single"/>
+          </w:rPr>
+          <w:t xml:space="preserve">13.  </w:t>
+        </w:r>
+        <w:r>
+          <w:rPr>
+            <w:b w:val="false"/>
+            <w:bCs w:val="false"/>
+            <w:i w:val="false"/>
+            <w:iCs w:val="false"/>
+            <w:color w:val="222629"/>
+            <w:sz w:val="20"/>
+            <w:szCs w:val="20"/>
+            <w:color w:val="0563C1"/>
+            <w:u w:val="single"/>
+          </w:rPr>
+          <w:t xml:space="preserve">What happens after approval</w:t>
+        </w:r>
+      </w:hyperlink>
     </w:p>
     <w:p>
       <w:pPr>
         <w:spacing w:after="70" w:before="0" w:line="276"/>
         <w:jc w:val="left"/>
       </w:pPr>
-      <w:r>
-        <w:rPr>
-          <w:b/>
-          <w:bCs/>
-          <w:i w:val="false"/>
-          <w:iCs w:val="false"/>
-          <w:color w:val="0F6E6E"/>
-          <w:sz w:val="20"/>
-          <w:szCs w:val="20"/>
-        </w:rPr>
-        <w:t xml:space="preserve">14.  </w:t>
-      </w:r>
-      <w:r>
-        <w:rPr>
-          <w:b w:val="false"/>
-          <w:bCs w:val="false"/>
-          <w:i w:val="false"/>
-          <w:iCs w:val="false"/>
-          <w:color w:val="222629"/>
-          <w:sz w:val="20"/>
-          <w:szCs w:val="20"/>
-        </w:rPr>
-        <w:t xml:space="preserve">Sign-off sheet</w:t>
-      </w:r>
+      <w:hyperlink w:anchor="sec_038" w:history="1">
+        <w:r>
+          <w:rPr>
+            <w:b/>
+            <w:bCs/>
+            <w:i w:val="false"/>
+            <w:iCs w:val="false"/>
+            <w:color w:val="0F6E6E"/>
+            <w:sz w:val="20"/>
+            <w:szCs w:val="20"/>
+            <w:color w:val="0563C1"/>
+            <w:u w:val="single"/>
+          </w:rPr>
+          <w:t xml:space="preserve">14.  </w:t>
+        </w:r>
+        <w:r>
+          <w:rPr>
+            <w:b w:val="false"/>
+            <w:bCs w:val="false"/>
+            <w:i w:val="false"/>
+            <w:iCs w:val="false"/>
+            <w:color w:val="222629"/>
+            <w:sz w:val="20"/>
+            <w:szCs w:val="20"/>
+            <w:color w:val="0563C1"/>
+            <w:u w:val="single"/>
+          </w:rPr>
+          <w:t xml:space="preserve">Sign-off sheet</w:t>
+        </w:r>
+      </w:hyperlink>
     </w:p>
     <w:p>
       <w:pPr>
         <w:spacing w:after="70" w:before="0" w:line="276"/>
         <w:jc w:val="left"/>
       </w:pPr>
-      <w:r>
-        <w:rPr>
-          <w:b/>
-          <w:bCs/>
-          <w:i w:val="false"/>
-          <w:iCs w:val="false"/>
-          <w:color w:val="0F6E6E"/>
-          <w:sz w:val="20"/>
-          <w:szCs w:val="20"/>
-        </w:rPr>
-        <w:t xml:space="preserve">—.  </w:t>
-      </w:r>
-      <w:r>
-        <w:rPr>
-          <w:b w:val="false"/>
-          <w:bCs w:val="false"/>
-          <w:i w:val="false"/>
-          <w:iCs w:val="false"/>
-          <w:color w:val="222629"/>
-          <w:sz w:val="20"/>
-          <w:szCs w:val="20"/>
-        </w:rPr>
-        <w:t xml:space="preserve">Appendix — Terms and internal references</w:t>
-      </w:r>
+      <w:hyperlink w:anchor="sec_042" w:history="1">
+        <w:r>
+          <w:rPr>
+            <w:b/>
+            <w:bCs/>
+            <w:i w:val="false"/>
+            <w:iCs w:val="false"/>
+            <w:color w:val="0F6E6E"/>
+            <w:sz w:val="20"/>
+            <w:szCs w:val="20"/>
+            <w:color w:val="0563C1"/>
+            <w:u w:val="single"/>
+          </w:rPr>
+          <w:t xml:space="preserve">—.  </w:t>
+        </w:r>
+        <w:r>
+          <w:rPr>
+            <w:b w:val="false"/>
+            <w:bCs w:val="false"/>
+            <w:i w:val="false"/>
+            <w:iCs w:val="false"/>
+            <w:color w:val="222629"/>
+            <w:sz w:val="20"/>
+            <w:szCs w:val="20"/>
+            <w:color w:val="0563C1"/>
+            <w:u w:val="single"/>
+          </w:rPr>
+          <w:t xml:space="preserve">Appendix — Terms and internal references</w:t>
+        </w:r>
+      </w:hyperlink>
     </w:p>
     <w:p>
       <w:pPr>
@@ -1791,6 +1908,7 @@
       </w:r>
     </w:p>
     <w:p>
+      <w:bookmarkStart w:id="2" w:name="sec_002"/>
       <w:pPr>
         <w:pStyle w:val="Heading2"/>
         <w:keepNext/>
@@ -1807,6 +1925,7 @@
         </w:rPr>
         <w:t xml:space="preserve">The three volumes, and what each is for</w:t>
       </w:r>
+      <w:bookmarkEnd w:id="2"/>
     </w:p>
     <w:tbl>
       <w:tblPr>
@@ -2022,7 +2141,7 @@
                 <w:sz w:val="18"/>
                 <w:szCs w:val="18"/>
               </w:rPr>
-              <w:t xml:space="preserve">Why the approval is needed, what a signature certifies, the two decision schedules, the ten open regulatory questions, a Product proposal on consent sequencing, the conditions that carry into build, and the sign-off sheet.</w:t>
+              <w:t>Why the approval is needed, what a signature certifies, the two decision schedules, the twelve open regulatory determinations, a Product proposal on consent sequencing, the conditions that carry into build, and the sign-off sheet.</w:t>
             </w:r>
           </w:p>
         </w:tc>
@@ -2144,7 +2263,7 @@
                 <w:sz w:val="18"/>
                 <w:szCs w:val="18"/>
               </w:rPr>
-              <w:t xml:space="preserve">All 38 consent rules in full, with the consent events, the evidence record, and the failure behaviour they govern.</w:t>
+              <w:t>All 42 consent rules in full, with the consent events, the evidence record, and the failure behaviour they govern.</w:t>
             </w:r>
           </w:p>
         </w:tc>
@@ -2265,7 +2384,7 @@
                 <w:sz w:val="18"/>
                 <w:szCs w:val="18"/>
               </w:rPr>
-              <w:t xml:space="preserve">All 48 suitability rules in full, with the question set, the computation, the outcome tables and the override policy.</w:t>
+              <w:t>All 62 suitability rules in full, with the question set, the computation, the outcome tables and the override policy.</w:t>
             </w:r>
           </w:p>
         </w:tc>
@@ -2358,10 +2477,11 @@
           <w:sz w:val="20"/>
           <w:szCs w:val="20"/>
         </w:rPr>
-        <w:t xml:space="preserve">Between them, the three volumes contain everything needed to complete this approval. No further document needs to be requested and no system access is required. Volume 1 is the decision; Volumes 2 and 3 are the substance being decided on.</w:t>
+        <w:t>Between them, the three volumes contain everything needed to review the proposed business behaviour and record the decisions. Regulatory permissibility remains open until Compliance completes §6 with authoritative sources and applicability determinations. Volume 1 records the decision; Volumes 2 and 3 contain the rules being decided on.</w:t>
       </w:r>
     </w:p>
     <w:p>
+      <w:bookmarkStart w:id="3" w:name="sec_003"/>
       <w:pPr>
         <w:pStyle w:val="Heading1"/>
         <w:keepNext/>
@@ -2382,6 +2502,7 @@
         </w:rPr>
         <w:t xml:space="preserve">1.  What Compliance is being asked to approve</w:t>
       </w:r>
+      <w:bookmarkEnd w:id="3"/>
     </w:p>
     <w:p>
       <w:pPr>
@@ -3201,10 +3322,11 @@
           <w:sz w:val="20"/>
           <w:szCs w:val="20"/>
         </w:rPr>
-        <w:t xml:space="preserve">Nothing here claims that Product has settled a regulatory question. Where the answer is Compliance’s, the question is written down, the position Product would take is stated, and the consequence of deciding otherwise is named. Ten such items are listed in §10 and §11. None of them blocks approval of D1 and D2, because all ten are wording, window or sequencing questions over a rule set and a record structure that do not change with the answer. That is the reason for specifying structure before text.</w:t>
+        <w:t>Nothing here claims that Product has settled a regulatory question. Where the answer is Compliance’s, the question is written down, the position Product would take is stated, and the consequence of deciding otherwise is named. Twelve determinations are listed in §10; OPEN-SUIT-01 and OPEN-CNS-06 block the decisions identified there, while the others constrain wording, windows or sequencing. Section 11 contains a separate Product proposal.</w:t>
       </w:r>
     </w:p>
     <w:p>
+      <w:bookmarkStart w:id="4" w:name="sec_004"/>
       <w:pPr>
         <w:pStyle w:val="Heading1"/>
         <w:keepNext/>
@@ -3224,6 +3346,7 @@
         </w:rPr>
         <w:t xml:space="preserve">2.  Executive summary</w:t>
       </w:r>
+      <w:bookmarkEnd w:id="4"/>
     </w:p>
     <w:p>
       <w:pPr>
@@ -3431,7 +3554,7 @@
                 <w:sz w:val="18"/>
                 <w:szCs w:val="18"/>
               </w:rPr>
-              <w:t xml:space="preserve">A fully specified suitability model: 12 inputs, 8 income bands, 5 age factors, a stated formula and a worked reference case, producing an outcome per product class rather than one overall verdict.</w:t>
+              <w:t>A fully specified suitability model: 16 inputs, 8 income bands, 5 age factors, a stated formula and a worked reference case, producing an outcome per product class rather than one overall verdict.</w:t>
             </w:r>
           </w:p>
         </w:tc>
@@ -3563,7 +3686,7 @@
                 <w:sz w:val="18"/>
                 <w:szCs w:val="18"/>
               </w:rPr>
-              <w:t xml:space="preserve">A 24-field consent evidence record and an 18-field suitability evaluation record, both append-only, both retained for seven years under write-once storage in an India region.</w:t>
+              <w:t>A 24-field consent evidence record and a 20-field suitability evaluation record, both append-only, both retained for seven years under write-once storage in an India region.</w:t>
             </w:r>
           </w:p>
         </w:tc>
@@ -3674,6 +3797,7 @@
       </w:r>
     </w:p>
     <w:p>
+      <w:bookmarkStart w:id="5" w:name="sec_005"/>
       <w:pPr>
         <w:pStyle w:val="Heading2"/>
         <w:keepNext/>
@@ -3690,6 +3814,7 @@
         </w:rPr>
         <w:t xml:space="preserve">Why the timing matters</w:t>
       </w:r>
+      <w:bookmarkEnd w:id="5"/>
     </w:p>
     <w:p>
       <w:pPr>
@@ -3743,6 +3868,7 @@
       </w:r>
     </w:p>
     <w:p>
+      <w:bookmarkStart w:id="6" w:name="sec_006"/>
       <w:pPr>
         <w:pStyle w:val="Heading2"/>
         <w:keepNext/>
@@ -3760,6 +3886,7 @@
         </w:rPr>
         <w:t xml:space="preserve">2.1  What changed at v1.1, and why</w:t>
       </w:r>
+      <w:bookmarkEnd w:id="6"/>
     </w:p>
     <w:p>
       <w:pPr>
@@ -5063,6 +5190,7 @@
       </w:tr>
     </w:tbl>
     <w:p>
+      <w:bookmarkStart w:id="7" w:name="sec_007"/>
       <w:pPr>
         <w:pStyle w:val="Heading1"/>
         <w:keepNext/>
@@ -5083,6 +5211,7 @@
         </w:rPr>
         <w:t xml:space="preserve">3.  Where this sits — scope, position and authority</w:t>
       </w:r>
+      <w:bookmarkEnd w:id="7"/>
     </w:p>
     <w:p>
       <w:pPr>
@@ -5103,6 +5232,7 @@
       </w:r>
     </w:p>
     <w:p>
+      <w:bookmarkStart w:id="8" w:name="sec_008"/>
       <w:pPr>
         <w:pStyle w:val="Heading2"/>
         <w:keepNext/>
@@ -5119,6 +5249,7 @@
         </w:rPr>
         <w:t xml:space="preserve">3.1  What the first release covers, and on whose authority</w:t>
       </w:r>
+      <w:bookmarkEnd w:id="8"/>
     </w:p>
     <w:p>
       <w:pPr>
@@ -5135,7 +5266,7 @@
           <w:sz w:val="20"/>
           <w:szCs w:val="20"/>
         </w:rPr>
-        <w:t xml:space="preserve">Throughout these documents the first release means one relationship manager selling one Term Life policy to one existing bank customer, from one insurer on the approved panel, end to end. Self-service and hybrid journeys are not in it. That is narrower than the original Day-1 framing, and the narrowing is a governed Product decision rather than a drafting convenience.</w:t>
+        <w:t>Throughout these documents the first release means one relationship manager selling one Term Life policy to one existing bank customer, from one Group A insurer on the approved panel, end to end. Self-service and hybrid journeys are not in it. This is the governed Product decision DEC-20260816-03 in docs/governance/registers/DECISION-REGISTER.md; the canonical release boundary is docs/governance/workstreams/WS-3-PLATFORM-CHARTER.md. The pending R0-SCOPE.md v0.4 republication does not expand R0.</w:t>
       </w:r>
     </w:p>
     <w:p>
@@ -5352,7 +5483,7 @@
                 <w:sz w:val="18"/>
                 <w:szCs w:val="18"/>
               </w:rPr>
-              <w:t xml:space="preserve">Assisted only. Self-service revisits at the second release, hybrid at the third, both with named revisit triggers. Superseded for the first release only by a recorded Product decision of 16 August 2026; the original decision text is preserved, not overwritten. Product’s stated reason: three journeys across sixteen missing capabilities, with no engineering foundation, is not a deliverable release. It is a sequencing change, not a scope reduction.</w:t>
+              <w:t>Assisted only. Self-service revisits at the second release, hybrid at the third, both with named revisit triggers. Superseded for the first release only by Product decision DEC-20260816-03 of 16 August 2026, recorded in docs/governance/registers/DECISION-REGISTER.md; the original decision text is preserved, not overwritten. Product’s stated reason: three journeys across sixteen missing capabilities, with no engineering foundation, is not a deliverable release. It is a sequencing change, not a scope reduction.</w:t>
             </w:r>
           </w:p>
         </w:tc>
@@ -5624,6 +5755,7 @@
       </w:r>
     </w:p>
     <w:p>
+      <w:bookmarkStart w:id="9" w:name="sec_009"/>
       <w:pPr>
         <w:pStyle w:val="Heading2"/>
         <w:keepNext/>
@@ -5641,6 +5773,7 @@
         </w:rPr>
         <w:t xml:space="preserve">3.2  What has actually been built — the uncomfortable part</w:t>
       </w:r>
+      <w:bookmarkEnd w:id="9"/>
     </w:p>
     <w:p>
       <w:pPr>
@@ -6352,6 +6485,7 @@
       </w:r>
     </w:p>
     <w:p>
+      <w:bookmarkStart w:id="10" w:name="sec_010"/>
       <w:pPr>
         <w:pStyle w:val="Heading2"/>
         <w:keepNext/>
@@ -6369,6 +6503,7 @@
         </w:rPr>
         <w:t xml:space="preserve">3.3  What binds, what is proposed, and where the decision goes</w:t>
       </w:r>
+      <w:bookmarkEnd w:id="10"/>
     </w:p>
     <w:p>
       <w:pPr>
@@ -6834,6 +6969,7 @@
       </w:r>
     </w:p>
     <w:p>
+      <w:bookmarkStart w:id="11" w:name="sec_011"/>
       <w:pPr>
         <w:pStyle w:val="Heading2"/>
         <w:keepNext/>
@@ -6850,6 +6986,7 @@
         </w:rPr>
         <w:t xml:space="preserve">Where each decision goes once it is made</w:t>
       </w:r>
+      <w:bookmarkEnd w:id="11"/>
     </w:p>
     <w:tbl>
       <w:tblPr>
@@ -7763,6 +7900,7 @@
       </w:tr>
     </w:tbl>
     <w:p>
+      <w:bookmarkStart w:id="12" w:name="sec_012"/>
       <w:pPr>
         <w:pStyle w:val="Heading1"/>
         <w:keepNext/>
@@ -7783,6 +7921,7 @@
         </w:rPr>
         <w:t xml:space="preserve">4.  What is submitted</w:t>
       </w:r>
+      <w:bookmarkEnd w:id="12"/>
     </w:p>
     <w:p>
       <w:pPr>
@@ -7799,7 +7938,7 @@
           <w:sz w:val="20"/>
           <w:szCs w:val="20"/>
         </w:rPr>
-        <w:t xml:space="preserve">Two rule packs, reproduced in full in the appendices to this document.</w:t>
+        <w:t>Two rule packs, issued as separate companion files: Volume 2 — Consent Rule Pack and Volume 3 — Suitability Rule Pack.</w:t>
       </w:r>
     </w:p>
     <w:p>
@@ -8827,6 +8966,7 @@
       </w:r>
     </w:p>
     <w:p>
+      <w:bookmarkStart w:id="13" w:name="sec_013"/>
       <w:pPr>
         <w:pStyle w:val="Heading2"/>
         <w:keepNext/>
@@ -8843,6 +8983,7 @@
         </w:rPr>
         <w:t xml:space="preserve">The two commitments the packs exist to make enforceable</w:t>
       </w:r>
+      <w:bookmarkEnd w:id="13"/>
     </w:p>
     <w:p>
       <w:pPr>
@@ -8957,6 +9098,7 @@
       </w:r>
     </w:p>
     <w:p>
+      <w:bookmarkStart w:id="14" w:name="sec_014"/>
       <w:pPr>
         <w:pStyle w:val="Heading1"/>
         <w:keepNext/>
@@ -8976,6 +9118,7 @@
         </w:rPr>
         <w:t xml:space="preserve">5.  Why a signature, and what it certifies</w:t>
       </w:r>
+      <w:bookmarkEnd w:id="14"/>
     </w:p>
     <w:p>
       <w:pPr>
@@ -9545,6 +9688,7 @@
       </w:r>
     </w:p>
     <w:p>
+      <w:bookmarkStart w:id="15" w:name="sec_015"/>
       <w:pPr>
         <w:pStyle w:val="Heading1"/>
         <w:keepNext/>
@@ -9565,6 +9709,7 @@
         </w:rPr>
         <w:t xml:space="preserve">6.  Regulatory basis and applicability</w:t>
       </w:r>
+      <w:bookmarkEnd w:id="15"/>
     </w:p>
     <w:p>
       <w:pPr>
@@ -9645,6 +9790,7 @@
       </w:r>
     </w:p>
     <w:p>
+      <w:bookmarkStart w:id="16" w:name="sec_016"/>
       <w:pPr>
         <w:pStyle w:val="Heading2"/>
         <w:keepNext/>
@@ -9661,6 +9807,7 @@
         </w:rPr>
         <w:t xml:space="preserve">6.1  The prior question: which entity, in which capacity</w:t>
       </w:r>
+      <w:bookmarkEnd w:id="16"/>
     </w:p>
     <w:p>
       <w:pPr>
@@ -10385,6 +10532,7 @@
       </w:tr>
     </w:tbl>
     <w:p>
+      <w:bookmarkStart w:id="17" w:name="sec_017"/>
       <w:pPr>
         <w:pStyle w:val="Heading2"/>
         <w:keepNext/>
@@ -10402,6 +10550,7 @@
         </w:rPr>
         <w:t xml:space="preserve">6.2  How each assertion is classified</w:t>
       </w:r>
+      <w:bookmarkEnd w:id="17"/>
     </w:p>
     <w:tbl>
       <w:tblPr>
@@ -11028,6 +11177,7 @@
       </w:r>
     </w:p>
     <w:p>
+      <w:bookmarkStart w:id="18" w:name="sec_018"/>
       <w:pPr>
         <w:pStyle w:val="Heading2"/>
         <w:keepNext/>
@@ -11045,6 +11195,7 @@
         </w:rPr>
         <w:t xml:space="preserve">6.3  The applicability schedule</w:t>
       </w:r>
+      <w:bookmarkEnd w:id="18"/>
     </w:p>
     <w:p>
       <w:pPr>
@@ -13161,6 +13312,7 @@
       </w:tr>
     </w:tbl>
     <w:p>
+      <w:bookmarkStart w:id="19" w:name="sec_019"/>
       <w:pPr>
         <w:pStyle w:val="Heading2"/>
         <w:keepNext/>
@@ -13178,6 +13330,7 @@
         </w:rPr>
         <w:t xml:space="preserve">6.4  Assertions Product has withdrawn or downgraded</w:t>
       </w:r>
+      <w:bookmarkEnd w:id="19"/>
     </w:p>
     <w:p>
       <w:pPr>
@@ -13540,6 +13693,7 @@
       </w:r>
     </w:p>
     <w:p>
+      <w:bookmarkStart w:id="20" w:name="sec_020"/>
       <w:pPr>
         <w:pStyle w:val="Heading1"/>
         <w:keepNext/>
@@ -13560,6 +13714,7 @@
         </w:rPr>
         <w:t xml:space="preserve">7.  How to read this document</w:t>
       </w:r>
+      <w:bookmarkEnd w:id="20"/>
     </w:p>
     <w:p>
       <w:pPr>
@@ -13576,10 +13731,11 @@
           <w:sz w:val="20"/>
           <w:szCs w:val="20"/>
         </w:rPr>
-        <w:t xml:space="preserve">Sections 6 and 7 are the decision schedules — one row per section of each pack, with a box to accept, amend or reject. Each row names the rules it covers and the section of Volume 2 or Volume 3 in which those rules are written out in full, in the same order.</w:t>
+        <w:t>Sections 8 and 9 are the decision schedules — one row per section of each pack, with a box to accept, amend or reject. Each row names the rules it covers and the section of Volume 2 or Volume 3 in which those rules are written out in full, in the same order.</w:t>
       </w:r>
     </w:p>
     <w:p>
+      <w:bookmarkStart w:id="21" w:name="sec_021"/>
       <w:pPr>
         <w:pStyle w:val="Heading2"/>
         <w:keepNext/>
@@ -13596,6 +13752,7 @@
         </w:rPr>
         <w:t xml:space="preserve">Conventions used in the rules</w:t>
       </w:r>
+      <w:bookmarkEnd w:id="21"/>
     </w:p>
     <w:tbl>
       <w:tblPr>
@@ -14080,6 +14237,7 @@
       </w:r>
     </w:p>
     <w:p>
+      <w:bookmarkStart w:id="22" w:name="sec_022"/>
       <w:pPr>
         <w:pStyle w:val="Heading3"/>
         <w:keepNext/>
@@ -14096,6 +14254,7 @@
         </w:rPr>
         <w:t xml:space="preserve">Design commitments Compliance can hold the build to</w:t>
       </w:r>
+      <w:bookmarkEnd w:id="22"/>
     </w:p>
     <w:p>
       <w:pPr>
@@ -14252,6 +14411,7 @@
       </w:r>
     </w:p>
     <w:p>
+      <w:bookmarkStart w:id="23" w:name="sec_023"/>
       <w:pPr>
         <w:pStyle w:val="Heading1"/>
         <w:keepNext/>
@@ -14272,6 +14432,7 @@
         </w:rPr>
         <w:t xml:space="preserve">8.  Decision Schedule A — Consent Rule Pack</w:t>
       </w:r>
+      <w:bookmarkEnd w:id="23"/>
     </w:p>
     <w:p>
       <w:pPr>
@@ -16295,7 +16456,7 @@
                 <w:sz w:val="18"/>
                 <w:szCs w:val="18"/>
               </w:rPr>
-              <w:t xml:space="preserve">Seven years from the journey’s terminal state, write-once storage in an India region, one record retrievable within 4 business hours and a full journey bundle within 1 business day, and retention that cannot be shortened by a configuration change.</w:t>
+              <w:t>Seven years from the terminal state of the latest journey that relied on the consent; expiry never means deletion; legal hold pauses deletion. Records use write-once storage in an India region, with one record retrievable within 4 business hours and a full journey bundle within 1 business day.</w:t>
             </w:r>
           </w:p>
         </w:tc>
@@ -16608,6 +16769,7 @@
       </w:r>
     </w:p>
     <w:p>
+      <w:bookmarkStart w:id="24" w:name="sec_024"/>
       <w:pPr>
         <w:pStyle w:val="Heading1"/>
         <w:keepNext/>
@@ -16628,6 +16790,7 @@
         </w:rPr>
         <w:t xml:space="preserve">9.  Decision Schedule B — Suitability Rule Pack</w:t>
       </w:r>
+      <w:bookmarkEnd w:id="24"/>
     </w:p>
     <w:p>
       <w:pPr>
@@ -16956,7 +17119,11 @@
                 <w:sz w:val="18"/>
                 <w:szCs w:val="18"/>
               </w:rPr>
-              <w:t xml:space="preserve">The question set</w:t>
+              <w:t>The question set</w:t>
+              <w:br/>
+              <w:t>16 inputs, SUIT-R01 – SUIT-R04</w:t>
+              <w:br/>
+              <w:t>Volume 3, §2</w:t>
             </w:r>
             <w:r>
               <w:rPr>
@@ -16968,33 +17135,28 @@
                 <w:sz w:val="18"/>
                 <w:szCs w:val="18"/>
               </w:rPr>
-              <w:br/>
-              <w:t xml:space="preserve"/>
-            </w:r>
-            <w:r>
-              <w:rPr>
-                <w:b w:val="false"/>
-                <w:bCs w:val="false"/>
-                <w:i w:val="false"/>
-                <w:iCs w:val="false"/>
-                <w:color w:val="222629"/>
-                <w:sz w:val="18"/>
-                <w:szCs w:val="18"/>
-              </w:rPr>
-              <w:t xml:space="preserve">12 inputs, SUIT-R01 – SUIT-R04</w:t>
-            </w:r>
-            <w:r>
-              <w:rPr>
-                <w:b w:val="false"/>
-                <w:bCs w:val="false"/>
-                <w:i w:val="false"/>
-                <w:iCs w:val="false"/>
-                <w:color w:val="222629"/>
-                <w:sz w:val="18"/>
-                <w:szCs w:val="18"/>
-              </w:rPr>
-              <w:br/>
-              <w:t xml:space="preserve">Volume 3, §2</w:t>
+            </w:r>
+            <w:r>
+              <w:rPr>
+                <w:b w:val="false"/>
+                <w:bCs w:val="false"/>
+                <w:i w:val="false"/>
+                <w:iCs w:val="false"/>
+                <w:color w:val="222629"/>
+                <w:sz w:val="18"/>
+                <w:szCs w:val="18"/>
+              </w:rPr>
+            </w:r>
+            <w:r>
+              <w:rPr>
+                <w:b w:val="false"/>
+                <w:bCs w:val="false"/>
+                <w:i w:val="false"/>
+                <w:iCs w:val="false"/>
+                <w:color w:val="222629"/>
+                <w:sz w:val="18"/>
+                <w:szCs w:val="18"/>
+              </w:rPr>
             </w:r>
           </w:p>
         </w:tc>
@@ -17024,7 +17186,7 @@
                 <w:sz w:val="18"/>
                 <w:szCs w:val="18"/>
               </w:rPr>
-              <w:t xml:space="preserve">That four inputs taken from bank records and eight asked of the customer constitute a documented need analysis; that a partial questionnaire produces no assessment at all; and that where a customer’s self-declared figure is lower than the figure the bank already holds, the higher figure is used and the discrepancy recorded.</w:t>
+              <w:t>That four inputs taken from bank records and twelve asked of the customer constitute a documented need analysis; that a partial questionnaire produces no assessment at all; and that where a customer’s self-declared figure is lower than the figure the bank already holds, the higher figure is used and the discrepancy recorded.</w:t>
             </w:r>
           </w:p>
         </w:tc>
@@ -17338,7 +17500,11 @@
                 <w:sz w:val="18"/>
                 <w:szCs w:val="18"/>
               </w:rPr>
-              <w:t xml:space="preserve">Product-class outcomes</w:t>
+              <w:t>Product-class outcomes</w:t>
+              <w:br/>
+              <w:t>SUIT-R09 – SUIT-R19c</w:t>
+              <w:br/>
+              <w:t>Volume 3, §4</w:t>
             </w:r>
             <w:r>
               <w:rPr>
@@ -17350,33 +17516,28 @@
                 <w:sz w:val="18"/>
                 <w:szCs w:val="18"/>
               </w:rPr>
-              <w:br/>
-              <w:t xml:space="preserve"/>
-            </w:r>
-            <w:r>
-              <w:rPr>
-                <w:b w:val="false"/>
-                <w:bCs w:val="false"/>
-                <w:i w:val="false"/>
-                <w:iCs w:val="false"/>
-                <w:color w:val="222629"/>
-                <w:sz w:val="18"/>
-                <w:szCs w:val="18"/>
-              </w:rPr>
-              <w:t xml:space="preserve">SUIT-R09 – SUIT-R19a</w:t>
-            </w:r>
-            <w:r>
-              <w:rPr>
-                <w:b w:val="false"/>
-                <w:bCs w:val="false"/>
-                <w:i w:val="false"/>
-                <w:iCs w:val="false"/>
-                <w:color w:val="222629"/>
-                <w:sz w:val="18"/>
-                <w:szCs w:val="18"/>
-              </w:rPr>
-              <w:br/>
-              <w:t xml:space="preserve">Volume 3, §4</w:t>
+            </w:r>
+            <w:r>
+              <w:rPr>
+                <w:b w:val="false"/>
+                <w:bCs w:val="false"/>
+                <w:i w:val="false"/>
+                <w:iCs w:val="false"/>
+                <w:color w:val="222629"/>
+                <w:sz w:val="18"/>
+                <w:szCs w:val="18"/>
+              </w:rPr>
+            </w:r>
+            <w:r>
+              <w:rPr>
+                <w:b w:val="false"/>
+                <w:bCs w:val="false"/>
+                <w:i w:val="false"/>
+                <w:iCs w:val="false"/>
+                <w:color w:val="222629"/>
+                <w:sz w:val="18"/>
+                <w:szCs w:val="18"/>
+              </w:rPr>
             </w:r>
           </w:p>
         </w:tc>
@@ -17529,7 +17690,11 @@
                 <w:sz w:val="18"/>
                 <w:szCs w:val="18"/>
               </w:rPr>
-              <w:t xml:space="preserve">The assessment record</w:t>
+              <w:t>The assessment record</w:t>
+              <w:br/>
+              <w:t>20 fields, SUIT-R21 – SUIT-R24a</w:t>
+              <w:br/>
+              <w:t>Volume 3, §5</w:t>
             </w:r>
             <w:r>
               <w:rPr>
@@ -17541,33 +17706,28 @@
                 <w:sz w:val="18"/>
                 <w:szCs w:val="18"/>
               </w:rPr>
-              <w:br/>
-              <w:t xml:space="preserve"/>
-            </w:r>
-            <w:r>
-              <w:rPr>
-                <w:b w:val="false"/>
-                <w:bCs w:val="false"/>
-                <w:i w:val="false"/>
-                <w:iCs w:val="false"/>
-                <w:color w:val="222629"/>
-                <w:sz w:val="18"/>
-                <w:szCs w:val="18"/>
-              </w:rPr>
-              <w:t xml:space="preserve">18 fields, SUIT-R21 – SUIT-R24</w:t>
-            </w:r>
-            <w:r>
-              <w:rPr>
-                <w:b w:val="false"/>
-                <w:bCs w:val="false"/>
-                <w:i w:val="false"/>
-                <w:iCs w:val="false"/>
-                <w:color w:val="222629"/>
-                <w:sz w:val="18"/>
-                <w:szCs w:val="18"/>
-              </w:rPr>
-              <w:br/>
-              <w:t xml:space="preserve">Volume 3, §5</w:t>
+            </w:r>
+            <w:r>
+              <w:rPr>
+                <w:b w:val="false"/>
+                <w:bCs w:val="false"/>
+                <w:i w:val="false"/>
+                <w:iCs w:val="false"/>
+                <w:color w:val="222629"/>
+                <w:sz w:val="18"/>
+                <w:szCs w:val="18"/>
+              </w:rPr>
+            </w:r>
+            <w:r>
+              <w:rPr>
+                <w:b w:val="false"/>
+                <w:bCs w:val="false"/>
+                <w:i w:val="false"/>
+                <w:iCs w:val="false"/>
+                <w:color w:val="222629"/>
+                <w:sz w:val="18"/>
+                <w:szCs w:val="18"/>
+              </w:rPr>
             </w:r>
           </w:p>
         </w:tc>
@@ -18744,7 +18904,7 @@
                 <w:sz w:val="18"/>
                 <w:szCs w:val="18"/>
               </w:rPr>
-              <w:t xml:space="preserve">That a customer may choose any product whose class outcome permits it, including one the model did not rank first, recorded as a divergence with a stated reason — and that this is a customer choice, not an override of the assessment.</w:t>
+              <w:t>That a customer may choose any product whose class outcome permits it, including a caution-eligible class when another class is suitable, recorded as a divergence with a customer-stated reason — and that this is a customer choice, not an override of the assessment.</w:t>
             </w:r>
           </w:p>
         </w:tc>
@@ -19250,6 +19410,7 @@
       </w:r>
     </w:p>
     <w:p>
+      <w:bookmarkStart w:id="25" w:name="sec_025"/>
       <w:pPr>
         <w:pStyle w:val="Heading1"/>
         <w:keepNext/>
@@ -19270,6 +19431,7 @@
         </w:rPr>
         <w:t xml:space="preserve">10.  Open items requiring a Compliance determination</w:t>
       </w:r>
+      <w:bookmarkEnd w:id="25"/>
     </w:p>
     <w:p>
       <w:pPr>
@@ -20863,6 +21025,7 @@
       </w:r>
     </w:p>
     <w:p>
+      <w:bookmarkStart w:id="26" w:name="sec_026"/>
       <w:pPr>
         <w:pStyle w:val="Heading1"/>
         <w:keepNext/>
@@ -20883,6 +21046,7 @@
         </w:rPr>
         <w:t xml:space="preserve">11.  Product proposal — consolidating consent into a single up-front ceremony</w:t>
       </w:r>
+      <w:bookmarkEnd w:id="26"/>
     </w:p>
     <w:p>
       <w:pPr>
@@ -20903,6 +21067,7 @@
       </w:r>
     </w:p>
     <w:p>
+      <w:bookmarkStart w:id="27" w:name="sec_027"/>
       <w:pPr>
         <w:pStyle w:val="Heading2"/>
         <w:keepNext/>
@@ -20919,6 +21084,7 @@
         </w:rPr>
         <w:t xml:space="preserve">11.1  The problem, stated plainly</w:t>
       </w:r>
+      <w:bookmarkEnd w:id="27"/>
     </w:p>
     <w:p>
       <w:pPr>
@@ -21951,6 +22117,7 @@
       </w:r>
     </w:p>
     <w:p>
+      <w:bookmarkStart w:id="28" w:name="sec_028"/>
       <w:pPr>
         <w:pStyle w:val="Heading2"/>
         <w:keepNext/>
@@ -21967,6 +22134,7 @@
         </w:rPr>
         <w:t xml:space="preserve">11.2  What was asked for, and what is actually available</w:t>
       </w:r>
+      <w:bookmarkEnd w:id="28"/>
     </w:p>
     <w:p>
       <w:pPr>
@@ -22546,6 +22714,7 @@
       </w:tr>
     </w:tbl>
     <w:p>
+      <w:bookmarkStart w:id="29" w:name="sec_029"/>
       <w:pPr>
         <w:pStyle w:val="Heading2"/>
         <w:keepNext/>
@@ -22562,6 +22731,7 @@
         </w:rPr>
         <w:t xml:space="preserve">11.3  The recommended design</w:t>
       </w:r>
+      <w:bookmarkEnd w:id="29"/>
     </w:p>
     <w:p>
       <w:pPr>
@@ -23318,6 +23488,7 @@
       </w:r>
     </w:p>
     <w:p>
+      <w:bookmarkStart w:id="30" w:name="sec_030"/>
       <w:pPr>
         <w:pStyle w:val="Heading3"/>
         <w:keepNext/>
@@ -23334,6 +23505,7 @@
         </w:rPr>
         <w:t xml:space="preserve">What this changes for the customer</w:t>
       </w:r>
+      <w:bookmarkEnd w:id="30"/>
     </w:p>
     <w:tbl>
       <w:tblPr>
@@ -23960,6 +24132,7 @@
       </w:r>
     </w:p>
     <w:p>
+      <w:bookmarkStart w:id="31" w:name="sec_031"/>
       <w:pPr>
         <w:pStyle w:val="Heading2"/>
         <w:keepNext/>
@@ -23977,6 +24150,7 @@
         </w:rPr>
         <w:t xml:space="preserve">11.4  Why this is a compliance improvement and not only an experience improvement</w:t>
       </w:r>
+      <w:bookmarkEnd w:id="31"/>
     </w:p>
     <w:p>
       <w:pPr>
@@ -24175,6 +24349,7 @@
       </w:r>
     </w:p>
     <w:p>
+      <w:bookmarkStart w:id="32" w:name="sec_032"/>
       <w:pPr>
         <w:pStyle w:val="Heading2"/>
         <w:keepNext/>
@@ -24191,6 +24366,7 @@
         </w:rPr>
         <w:t xml:space="preserve">11.5  Rule changes required, if approved</w:t>
       </w:r>
+      <w:bookmarkEnd w:id="32"/>
     </w:p>
     <w:p>
       <w:pPr>
@@ -25496,6 +25672,7 @@
       </w:r>
     </w:p>
     <w:p>
+      <w:bookmarkStart w:id="33" w:name="sec_033"/>
       <w:pPr>
         <w:pStyle w:val="Heading2"/>
         <w:keepNext/>
@@ -25512,6 +25689,7 @@
         </w:rPr>
         <w:t xml:space="preserve">11.6  If Compliance declines the panel-scoped consent</w:t>
       </w:r>
+      <w:bookmarkEnd w:id="33"/>
     </w:p>
     <w:p>
       <w:pPr>
@@ -25621,6 +25799,7 @@
       </w:r>
     </w:p>
     <w:p>
+      <w:bookmarkStart w:id="34" w:name="sec_034"/>
       <w:pPr>
         <w:pStyle w:val="Heading2"/>
         <w:keepNext/>
@@ -25637,6 +25816,7 @@
         </w:rPr>
         <w:t xml:space="preserve">11.7  What this changes in the work ahead</w:t>
       </w:r>
+      <w:bookmarkEnd w:id="34"/>
     </w:p>
     <w:tbl>
       <w:tblPr>
@@ -26120,6 +26300,7 @@
       </w:tr>
     </w:tbl>
     <w:p>
+      <w:bookmarkStart w:id="35" w:name="sec_035"/>
       <w:pPr>
         <w:pStyle w:val="Heading1"/>
         <w:keepNext/>
@@ -26140,6 +26321,7 @@
         </w:rPr>
         <w:t xml:space="preserve">12.  Conditions that carry forward into build and run</w:t>
       </w:r>
+      <w:bookmarkEnd w:id="35"/>
     </w:p>
     <w:p>
       <w:pPr>
@@ -26704,6 +26886,7 @@
       </w:r>
     </w:p>
     <w:p>
+      <w:bookmarkStart w:id="36" w:name="sec_036"/>
       <w:pPr>
         <w:pStyle w:val="Heading2"/>
         <w:keepNext/>
@@ -26720,6 +26903,7 @@
         </w:rPr>
         <w:t xml:space="preserve">Other approvals still required</w:t>
       </w:r>
+      <w:bookmarkEnd w:id="36"/>
     </w:p>
     <w:p>
       <w:pPr>
@@ -27350,6 +27534,7 @@
       </w:tr>
     </w:tbl>
     <w:p>
+      <w:bookmarkStart w:id="37" w:name="sec_037"/>
       <w:pPr>
         <w:pStyle w:val="Heading1"/>
         <w:keepNext/>
@@ -27369,6 +27554,7 @@
         </w:rPr>
         <w:t xml:space="preserve">13.  What happens after approval</w:t>
       </w:r>
+      <w:bookmarkEnd w:id="37"/>
     </w:p>
     <w:tbl>
       <w:tblPr>
@@ -28467,6 +28653,7 @@
       </w:r>
     </w:p>
     <w:p>
+      <w:bookmarkStart w:id="38" w:name="sec_038"/>
       <w:pPr>
         <w:pStyle w:val="Heading1"/>
         <w:keepNext/>
@@ -28487,6 +28674,7 @@
         </w:rPr>
         <w:t xml:space="preserve">14.  Sign-off sheet</w:t>
       </w:r>
+      <w:bookmarkEnd w:id="38"/>
     </w:p>
     <w:p>
       <w:pPr>
@@ -28515,6 +28703,7 @@
       </w:r>
     </w:p>
     <w:p>
+      <w:bookmarkStart w:id="39" w:name="sec_039"/>
       <w:pPr>
         <w:pStyle w:val="Heading2"/>
         <w:keepNext/>
@@ -28531,6 +28720,7 @@
         </w:rPr>
         <w:t xml:space="preserve">Primary approval — human signature mandatory</w:t>
       </w:r>
+      <w:bookmarkEnd w:id="39"/>
     </w:p>
     <w:tbl>
       <w:tblPr>
@@ -28676,7 +28866,7 @@
                 <w:sz w:val="18"/>
                 <w:szCs w:val="18"/>
               </w:rPr>
-              <w:t xml:space="preserve">Regulatory permissibility of both rule packs; the basis for statement and disclosure wording; the sequencing of consent within the journey; the retention basis; the ten open determinations in §10; and the consent-consolidation proposal in §11, including OPEN-CNS-06 and OPEN-CNS-07.</w:t>
+              <w:t>Regulatory permissibility of both rule packs; the basis for statement and disclosure wording; the sequencing of consent within the journey; the retention basis; the twelve open determinations in §10; and the consent-consolidation proposal in §11, including OPEN-CNS-06 and OPEN-CNS-07.</w:t>
             </w:r>
           </w:p>
         </w:tc>
@@ -29025,6 +29215,7 @@
       </w:r>
     </w:p>
     <w:p>
+      <w:bookmarkStart w:id="40" w:name="sec_040"/>
       <w:pPr>
         <w:pStyle w:val="Heading2"/>
         <w:keepNext/>
@@ -29041,6 +29232,7 @@
         </w:rPr>
         <w:t xml:space="preserve">Product decision — required, and not satisfied by the drafting of this pack</w:t>
       </w:r>
+      <w:bookmarkEnd w:id="40"/>
     </w:p>
     <w:p>
       <w:pPr>
@@ -29553,6 +29745,7 @@
       </w:r>
     </w:p>
     <w:p>
+      <w:bookmarkStart w:id="41" w:name="sec_041"/>
       <w:pPr>
         <w:pStyle w:val="Heading2"/>
         <w:keepNext/>
@@ -29569,6 +29762,7 @@
         </w:rPr>
         <w:t xml:space="preserve">Supporting conclusions</w:t>
       </w:r>
+      <w:bookmarkEnd w:id="41"/>
     </w:p>
     <w:tbl>
       <w:tblPr>
@@ -32148,6 +32342,7 @@
       </w:r>
     </w:p>
     <w:p>
+      <w:bookmarkStart w:id="42" w:name="sec_042"/>
       <w:pPr>
         <w:pStyle w:val="Heading1"/>
         <w:keepNext/>
@@ -32168,6 +32363,7 @@
         </w:rPr>
         <w:t xml:space="preserve">Appendix — Terms and internal references</w:t>
       </w:r>
+      <w:bookmarkEnd w:id="42"/>
     </w:p>
     <w:p>
       <w:pPr>
@@ -32188,6 +32384,7 @@
       </w:r>
     </w:p>
     <w:p>
+      <w:bookmarkStart w:id="43" w:name="sec_043"/>
       <w:pPr>
         <w:pStyle w:val="Heading2"/>
         <w:keepNext/>
@@ -32204,6 +32401,7 @@
         </w:rPr>
         <w:t xml:space="preserve">Part 1 — Terms used in the rules</w:t>
       </w:r>
+      <w:bookmarkEnd w:id="43"/>
     </w:p>
     <w:tbl>
       <w:tblPr>
@@ -32944,7 +33142,7 @@
                 <w:sz w:val="18"/>
                 <w:szCs w:val="18"/>
               </w:rPr>
-              <w:t xml:space="preserve">A sharing consent that names every insurer on the panel at the point of capture, later narrowed to one by the customer’s product selection. Proposed in §9; not part of the packs as drafted.</w:t>
+              <w:t>A sharing consent that names every insurer on the panel at the point of capture, later narrowed to one by the customer’s product selection. Proposed in Volume 1, §11; not part of the packs as drafted.</w:t>
             </w:r>
           </w:p>
         </w:tc>
@@ -33215,6 +33413,7 @@
       </w:tr>
     </w:tbl>
     <w:p>
+      <w:bookmarkStart w:id="44" w:name="sec_044"/>
       <w:pPr>
         <w:pStyle w:val="Heading2"/>
         <w:keepNext/>
@@ -33232,6 +33431,7 @@
         </w:rPr>
         <w:t xml:space="preserve">Part 2 — Internal programme references</w:t>
       </w:r>
+      <w:bookmarkEnd w:id="44"/>
     </w:p>
     <w:p>
       <w:pPr>
@@ -34358,7 +34558,7 @@
           <w:sz w:val="17"/>
           <w:szCs w:val="17"/>
         </w:rPr>
-        <w:t xml:space="preserve">Volume 1 of 3 — Decision Pack · Prepared by Rajal, Principal Insurance Platform Product Owner · AU Bank Insurance Distribution Platform · 17 August 2026 · Approval reference COMP-APPROVE-CNS-SUIT-v1.1</w:t>
+        <w:t>Volume 1 of 3 — Decision Pack · AI-drafted for Rajal and Shailja review — unsigned · AU Bank Insurance Distribution Platform · 17 August 2026 · Approval reference COMP-APPROVE-CNS-SUIT-v1.1</w:t>
       </w:r>
     </w:p>
     <w:sectPr>

</xml_diff>

<commit_message>
docs(compliance): restore sections 11-12 and port companion edits
Co-Authored-By: Claude Opus 5 <noreply@anthropic.com>
Claude-Session: https://claude.ai/code/session_01HuS2t8c6ENWd1P8UC8V9HM
</commit_message>
<xml_diff>
--- a/docs/au-bank-insurance-platform/rule-packs/approval/1-Decision-Pack.docx
+++ b/docs/au-bank-insurance-platform/rule-packs/approval/1-Decision-Pack.docx
@@ -30,7 +30,7 @@
     </w:p>
     <w:p>
       <w:pPr>
-        <w:spacing w:after="400" w:before="0" w:line="276"/>
+        <w:spacing w:after="60" w:before="0" w:line="276"/>
         <w:jc w:val="left"/>
       </w:pPr>
       <w:r>
@@ -44,6 +44,36 @@
           <w:szCs w:val="18"/>
         </w:rPr>
         <w:t xml:space="preserve">Consent and suitability controls for the first release</w:t>
+      </w:r>
+    </w:p>
+    <w:p>
+      <w:pPr>
+        <w:spacing w:after="400" w:before="0" w:line="276"/>
+        <w:jc w:val="left"/>
+      </w:pPr>
+      <w:r>
+        <w:rPr>
+          <w:b w:val="false"/>
+          <w:bCs w:val="false"/>
+          <w:i w:val="false"/>
+          <w:iCs w:val="false"/>
+          <w:color w:val="5A6570"/>
+          <w:sz w:val="17"/>
+          <w:szCs w:val="17"/>
+        </w:rPr>
+        <w:t xml:space="preserve">Companion files: </w:t>
+      </w:r>
+      <w:r>
+        <w:rPr>
+          <w:b/>
+          <w:bCs/>
+          <w:i w:val="false"/>
+          <w:iCs w:val="false"/>
+          <w:color w:val="0F6E6E"/>
+          <w:sz w:val="17"/>
+          <w:szCs w:val="17"/>
+        </w:rPr>
+        <w:t xml:space="preserve">2-Consent-Rule-Pack.docx  ·  3-Suitability-Rule-Pack.docx</w:t>
       </w:r>
     </w:p>
     <w:p>
@@ -1095,7 +1125,7 @@
                 <w:sz w:val="18"/>
                 <w:szCs w:val="18"/>
               </w:rPr>
-              <w:t xml:space="preserve">The first release — Life products (Term, Savings/Endowment and unit-linked), sold to existing bank customers, assisted by a relationship manager, through the approved insurer panel</w:t>
+              <w:t xml:space="preserve">R0 execution — one Term Life sale to an existing bank customer, assisted by a relationship manager, through one insurer on the approved panel. The suitability model also covers Savings/Endowment and unit-linked classes so that later governed releases do not need a new model; approving the model does not move those classes into R0.</w:t>
             </w:r>
           </w:p>
         </w:tc>
@@ -1160,19 +1190,19 @@
                 <w:sz w:val="18"/>
                 <w:szCs w:val="18"/>
               </w:rPr>
-              <w:t xml:space="preserve">Yes, as a set of three. </w:t>
-            </w:r>
-            <w:r>
-              <w:rPr>
-                <w:b w:val="false"/>
-                <w:bCs w:val="false"/>
-                <w:i w:val="false"/>
-                <w:iCs w:val="false"/>
-                <w:color w:val="222629"/>
-                <w:sz w:val="18"/>
-                <w:szCs w:val="18"/>
-              </w:rPr>
-              <w:t xml:space="preserve">Every rule submitted for approval is reproduced in full in Volumes 2 and 3. Nothing outside these three documents needs to be obtained.</w:t>
+              <w:t xml:space="preserve">Yes for the business behaviour, as a set of three. </w:t>
+            </w:r>
+            <w:r>
+              <w:rPr>
+                <w:b w:val="false"/>
+                <w:bCs w:val="false"/>
+                <w:i w:val="false"/>
+                <w:iCs w:val="false"/>
+                <w:color w:val="222629"/>
+                <w:sz w:val="18"/>
+                <w:szCs w:val="18"/>
+              </w:rPr>
+              <w:t xml:space="preserve">Every rule submitted is reproduced in full in Volumes 2 and 3. A conclusion on regulatory permissibility needs one thing more: §6 completed with authoritative sources and applicability determinations. Unresolved rows route to the Compliance &amp; Risk Head with Legal support.</w:t>
             </w:r>
           </w:p>
         </w:tc>
@@ -3231,7 +3261,7 @@
           <w:sz w:val="20"/>
           <w:szCs w:val="20"/>
         </w:rPr>
-        <w:t xml:space="preserve">Nothing here claims that Product has settled a regulatory question. Where the answer is Compliance’s, the question is written down, the position Product would take is stated, and the consequence of deciding otherwise is named. Ten such items are listed in §10 and §11. None of them blocks approval of D1 and D2, because all ten are wording, window or sequencing questions over a rule set and a record structure that do not change with the answer. That is the reason for specifying structure before text.</w:t>
+        <w:t xml:space="preserve">Nothing here claims that Product has settled a regulatory question. Where the answer is Compliance’s, the question is written down, the position Product would take is stated, and the consequence of deciding otherwise is named. Twelve are listed in §10, and a thirteenth — a scope question — in §3.1. Two of them block, and are marked as blocking; the rest do not, because they are wording, window or sequencing questions over a rule set and a record structure that do not change with the answer. That is the reason for specifying structure before text.</w:t>
       </w:r>
     </w:p>
     <w:p>
@@ -7829,7 +7859,7 @@
           <w:sz w:val="20"/>
           <w:szCs w:val="20"/>
         </w:rPr>
-        <w:t xml:space="preserve">Two rule packs, reproduced in full in the appendices to this document.</w:t>
+        <w:t xml:space="preserve">Two rule packs, issued as separate companion files: Volume 2 — Consent Rule Pack, and Volume 3 — Suitability Rule Pack.</w:t>
       </w:r>
     </w:p>
     <w:p>
@@ -13666,7 +13696,7 @@
           <w:sz w:val="20"/>
           <w:szCs w:val="20"/>
         </w:rPr>
-        <w:t xml:space="preserve">Sections 6 and 7 are the decision schedules — one row per section of each pack, with a box to accept, amend or reject. Each row names the rules it covers and the section of Volume 2 or Volume 3 in which those rules are written out in full, in the same order.</w:t>
+        <w:t xml:space="preserve">Sections 8 and 9 are the decision schedules — one row per section of each pack, with a box to accept, amend or reject. Each row names the rules it covers and the section of Volume 2 or Volume 3 in which those rules are written out in full, in the same order.</w:t>
       </w:r>
     </w:p>
     <w:p>
@@ -16452,7 +16482,7 @@
                 <w:sz w:val="18"/>
                 <w:szCs w:val="18"/>
               </w:rPr>
-              <w:t xml:space="preserve">Seven years from the journey’s terminal state, write-once storage in an India region, one record retrievable within 4 business hours and a full journey bundle within 1 business day, and retention that cannot be shortened by a configuration change.</w:t>
+              <w:t xml:space="preserve">Seven years from the terminal state of the latest journey that relied on the consent; expiry never means deletion; a legal hold pauses disposal. Write-once storage in an India region, one record retrievable within 4 business hours and a full journey bundle within 1 business day, and retention that cannot be shortened by a configuration change.</w:t>
             </w:r>
           </w:p>
         </w:tc>
@@ -17138,7 +17168,7 @@
                 <w:sz w:val="18"/>
                 <w:szCs w:val="18"/>
               </w:rPr>
-              <w:t xml:space="preserve">12 inputs, SUIT-R01 – SUIT-R04</w:t>
+              <w:t xml:space="preserve">16 inputs, SUIT-R01 – SUIT-R04</w:t>
             </w:r>
             <w:r>
               <w:rPr>
@@ -17520,7 +17550,7 @@
                 <w:sz w:val="18"/>
                 <w:szCs w:val="18"/>
               </w:rPr>
-              <w:t xml:space="preserve">SUIT-R09 – SUIT-R19a</w:t>
+              <w:t xml:space="preserve">SUIT-R09 – SUIT-R19c</w:t>
             </w:r>
             <w:r>
               <w:rPr>
@@ -17711,7 +17741,7 @@
                 <w:sz w:val="18"/>
                 <w:szCs w:val="18"/>
               </w:rPr>
-              <w:t xml:space="preserve">18 fields, SUIT-R21 – SUIT-R24</w:t>
+              <w:t xml:space="preserve">20 fields, SUIT-R21 – SUIT-R24a</w:t>
             </w:r>
             <w:r>
               <w:rPr>
@@ -18901,7 +18931,7 @@
                 <w:sz w:val="18"/>
                 <w:szCs w:val="18"/>
               </w:rPr>
-              <w:t xml:space="preserve">That a customer may choose any product whose class outcome permits it, including one the model did not rank first, recorded as a divergence with a stated reason — and that this is a customer choice, not an override of the assessment.</w:t>
+              <w:t xml:space="preserve">That a customer may choose any product whose class outcome permits a quote, including a caution-carrying class while another class is unqualified, recorded as a divergence with a customer-stated reason — and that this is a customer choice, not an override of the assessment.</w:t>
             </w:r>
           </w:p>
         </w:tc>
@@ -20992,6 +21022,260 @@
           </w:p>
         </w:tc>
       </w:tr>
+      <w:tr>
+        <w:trPr>
+          <w:cantSplit/>
+        </w:trPr>
+        <w:tc>
+          <w:tcPr>
+            <w:tcW w:type="dxa" w:w="1157"/>
+            <w:tcMar>
+              <w:top w:type="dxa" w:w="90"/>
+              <w:left w:type="dxa" w:w="130"/>
+              <w:bottom w:type="dxa" w:w="90"/>
+              <w:right w:type="dxa" w:w="130"/>
+            </w:tcMar>
+            <w:vAlign w:val="top"/>
+          </w:tcPr>
+          <w:p>
+            <w:pPr>
+              <w:spacing w:after="40" w:before="40" w:line="252"/>
+              <w:jc w:val="left"/>
+            </w:pPr>
+            <w:r>
+              <w:rPr>
+                <w:b/>
+                <w:bCs/>
+                <w:i w:val="false"/>
+                <w:iCs w:val="false"/>
+                <w:color w:val="222629"/>
+                <w:sz w:val="18"/>
+                <w:szCs w:val="18"/>
+              </w:rPr>
+              <w:t xml:space="preserve">OPEN-SUIT-03</w:t>
+            </w:r>
+          </w:p>
+        </w:tc>
+        <w:tc>
+          <w:tcPr>
+            <w:tcW w:type="dxa" w:w="2602"/>
+            <w:tcMar>
+              <w:top w:type="dxa" w:w="90"/>
+              <w:left w:type="dxa" w:w="130"/>
+              <w:bottom w:type="dxa" w:w="90"/>
+              <w:right w:type="dxa" w:w="130"/>
+            </w:tcMar>
+            <w:vAlign w:val="top"/>
+          </w:tcPr>
+          <w:p>
+            <w:pPr>
+              <w:spacing w:after="40" w:before="40" w:line="252"/>
+              <w:jc w:val="left"/>
+            </w:pPr>
+            <w:r>
+              <w:rPr>
+                <w:b w:val="false"/>
+                <w:bCs w:val="false"/>
+                <w:i w:val="false"/>
+                <w:iCs w:val="false"/>
+                <w:color w:val="222629"/>
+                <w:sz w:val="18"/>
+                <w:szCs w:val="18"/>
+              </w:rPr>
+              <w:t xml:space="preserve">The approved wording of the caution disclosure and the replacement disclosure.</w:t>
+            </w:r>
+          </w:p>
+        </w:tc>
+        <w:tc>
+          <w:tcPr>
+            <w:tcW w:type="dxa" w:w="3759"/>
+            <w:tcMar>
+              <w:top w:type="dxa" w:w="90"/>
+              <w:left w:type="dxa" w:w="130"/>
+              <w:bottom w:type="dxa" w:w="90"/>
+              <w:right w:type="dxa" w:w="130"/>
+            </w:tcMar>
+            <w:vAlign w:val="top"/>
+          </w:tcPr>
+          <w:p>
+            <w:pPr>
+              <w:spacing w:after="40" w:before="40" w:line="252"/>
+              <w:jc w:val="left"/>
+            </w:pPr>
+            <w:r>
+              <w:rPr>
+                <w:b w:val="false"/>
+                <w:bCs w:val="false"/>
+                <w:i w:val="false"/>
+                <w:iCs w:val="false"/>
+                <w:color w:val="222629"/>
+                <w:sz w:val="18"/>
+                <w:szCs w:val="18"/>
+              </w:rPr>
+              <w:t xml:space="preserve">Compliance-authored with Legal. The packs define when a disclosure fires, what it must name and how it is acknowledged; they do not draft its text.</w:t>
+            </w:r>
+          </w:p>
+        </w:tc>
+        <w:tc>
+          <w:tcPr>
+            <w:tcW w:type="dxa" w:w="2120"/>
+            <w:tcMar>
+              <w:top w:type="dxa" w:w="90"/>
+              <w:left w:type="dxa" w:w="130"/>
+              <w:bottom w:type="dxa" w:w="90"/>
+              <w:right w:type="dxa" w:w="130"/>
+            </w:tcMar>
+            <w:vAlign w:val="top"/>
+          </w:tcPr>
+          <w:p>
+            <w:pPr>
+              <w:spacing w:after="40" w:before="40" w:line="252"/>
+              <w:jc w:val="left"/>
+            </w:pPr>
+            <w:r>
+              <w:rPr>
+                <w:b w:val="false"/>
+                <w:bCs w:val="false"/>
+                <w:i w:val="false"/>
+                <w:iCs w:val="false"/>
+                <w:color w:val="222629"/>
+                <w:sz w:val="18"/>
+                <w:szCs w:val="18"/>
+              </w:rPr>
+              <w:t xml:space="preserve">No for the schedules. Blocks the customer-facing wording.</w:t>
+            </w:r>
+          </w:p>
+        </w:tc>
+      </w:tr>
+      <w:tr>
+        <w:trPr>
+          <w:cantSplit/>
+        </w:trPr>
+        <w:tc>
+          <w:tcPr>
+            <w:tcW w:type="dxa" w:w="1157"/>
+            <w:shd w:fill="F1F5F8" w:color="auto" w:val="clear"/>
+            <w:tcMar>
+              <w:top w:type="dxa" w:w="90"/>
+              <w:left w:type="dxa" w:w="130"/>
+              <w:bottom w:type="dxa" w:w="90"/>
+              <w:right w:type="dxa" w:w="130"/>
+            </w:tcMar>
+            <w:vAlign w:val="top"/>
+          </w:tcPr>
+          <w:p>
+            <w:pPr>
+              <w:spacing w:after="40" w:before="40" w:line="252"/>
+              <w:jc w:val="left"/>
+            </w:pPr>
+            <w:r>
+              <w:rPr>
+                <w:b/>
+                <w:bCs/>
+                <w:i w:val="false"/>
+                <w:iCs w:val="false"/>
+                <w:color w:val="222629"/>
+                <w:sz w:val="18"/>
+                <w:szCs w:val="18"/>
+              </w:rPr>
+              <w:t xml:space="preserve">OPEN-SUIT-05</w:t>
+            </w:r>
+          </w:p>
+        </w:tc>
+        <w:tc>
+          <w:tcPr>
+            <w:tcW w:type="dxa" w:w="2602"/>
+            <w:shd w:fill="F1F5F8" w:color="auto" w:val="clear"/>
+            <w:tcMar>
+              <w:top w:type="dxa" w:w="90"/>
+              <w:left w:type="dxa" w:w="130"/>
+              <w:bottom w:type="dxa" w:w="90"/>
+              <w:right w:type="dxa" w:w="130"/>
+            </w:tcMar>
+            <w:vAlign w:val="top"/>
+          </w:tcPr>
+          <w:p>
+            <w:pPr>
+              <w:spacing w:after="40" w:before="40" w:line="252"/>
+              <w:jc w:val="left"/>
+            </w:pPr>
+            <w:r>
+              <w:rPr>
+                <w:b w:val="false"/>
+                <w:bCs w:val="false"/>
+                <w:i w:val="false"/>
+                <w:iCs w:val="false"/>
+                <w:color w:val="222629"/>
+                <w:sz w:val="18"/>
+                <w:szCs w:val="18"/>
+              </w:rPr>
+              <w:t xml:space="preserve">Whether any insurer on the approved panel imposes suitability requirements exceeding this model.</w:t>
+            </w:r>
+          </w:p>
+        </w:tc>
+        <w:tc>
+          <w:tcPr>
+            <w:tcW w:type="dxa" w:w="3759"/>
+            <w:shd w:fill="F1F5F8" w:color="auto" w:val="clear"/>
+            <w:tcMar>
+              <w:top w:type="dxa" w:w="90"/>
+              <w:left w:type="dxa" w:w="130"/>
+              <w:bottom w:type="dxa" w:w="90"/>
+              <w:right w:type="dxa" w:w="130"/>
+            </w:tcMar>
+            <w:vAlign w:val="top"/>
+          </w:tcPr>
+          <w:p>
+            <w:pPr>
+              <w:spacing w:after="40" w:before="40" w:line="252"/>
+              <w:jc w:val="left"/>
+            </w:pPr>
+            <w:r>
+              <w:rPr>
+                <w:b w:val="false"/>
+                <w:bCs w:val="false"/>
+                <w:i w:val="false"/>
+                <w:iCs w:val="false"/>
+                <w:color w:val="222629"/>
+                <w:sz w:val="18"/>
+                <w:szCs w:val="18"/>
+              </w:rPr>
+              <w:t xml:space="preserve">Treat the model as the floor and any insurer requirement as additive. Product cannot answer this without the panel contracts.</w:t>
+            </w:r>
+          </w:p>
+        </w:tc>
+        <w:tc>
+          <w:tcPr>
+            <w:tcW w:type="dxa" w:w="2120"/>
+            <w:shd w:fill="F1F5F8" w:color="auto" w:val="clear"/>
+            <w:tcMar>
+              <w:top w:type="dxa" w:w="90"/>
+              <w:left w:type="dxa" w:w="130"/>
+              <w:bottom w:type="dxa" w:w="90"/>
+              <w:right w:type="dxa" w:w="130"/>
+            </w:tcMar>
+            <w:vAlign w:val="top"/>
+          </w:tcPr>
+          <w:p>
+            <w:pPr>
+              <w:spacing w:after="40" w:before="40" w:line="252"/>
+              <w:jc w:val="left"/>
+            </w:pPr>
+            <w:r>
+              <w:rPr>
+                <w:b w:val="false"/>
+                <w:bCs w:val="false"/>
+                <w:i w:val="false"/>
+                <w:iCs w:val="false"/>
+                <w:color w:val="222629"/>
+                <w:sz w:val="18"/>
+                <w:szCs w:val="18"/>
+              </w:rPr>
+              <w:t xml:space="preserve">No — additive requirements do not change the rules here, they add to them. Owner: Bancassurance with Compliance.</w:t>
+            </w:r>
+          </w:p>
+        </w:tc>
+      </w:tr>
     </w:tbl>
     <w:p>
       <w:pPr>
@@ -21016,7 +21300,7 @@
           <w:sz w:val="19"/>
           <w:szCs w:val="19"/>
         </w:rPr>
-        <w:t xml:space="preserve">Two further items are open and do not require a determination in this sitting: the approved wording of the caution and replacement disclosures (OPEN-SUIT-03, with Legal), and whether any insurer on the panel imposes suitability requirements exceeding this model (OPEN-SUIT-05, with Bancassurance).</w:t>
+        <w:t xml:space="preserve">A thirteenth determination, OPEN-SCOPE-01, sits in §3.1 because it is a scope question rather than a regulatory one: whether the controlled redirect to an off-panel insurer is in the first release. If it is, these packs are incomplete.</w:t>
       </w:r>
     </w:p>
     <w:p>
@@ -24024,7 +24308,7 @@
                 <w:sz w:val="18"/>
                 <w:szCs w:val="18"/>
               </w:rPr>
-              <w:t xml:space="preserve">Returning customer at 31–90 days, clean profile — data-processing and solicitation consent still valid, but sharing consent and the assessment have expired</w:t>
+              <w:t xml:space="preserve">Returning customer at 31–90 days — data-processing and solicitation consent still valid, but sharing consent and the assessment have expired</w:t>
             </w:r>
           </w:p>
         </w:tc>
@@ -24113,7 +24397,7 @@
           <w:sz w:val="20"/>
           <w:szCs w:val="20"/>
         </w:rPr>
-        <w:t xml:space="preserve">The two returning-customer rows are set out separately because the windows differ and it would be misleading to average them. Data-processing and solicitation consent last 90 days; sharing consent lasts 30, and a suitability assessment lasts 30. A customer returning inside 30 days meets no interaction at all. A customer returning on day 45 is re-assessed and gives a fresh sharing consent, but is not asked again for permission the bank already holds. The rule that produces this is already in the pack: reuse is bounded by customer, event, scope and window together — all four.</w:t>
+        <w:t xml:space="preserve">The two returning-customer rows are set out separately because the windows differ and it would be misleading to average them. Data-processing and solicitation consent last 90 days; sharing consent lasts 30, and a suitability assessment lasts 30. A customer returning inside 30 days meets no interaction at all. A customer returning on day 45 is re-assessed and gives a fresh sharing consent, but is not asked again for permission the bank already holds.</w:t>
       </w:r>
     </w:p>
     <w:p>
@@ -24388,10 +24672,10 @@
         </w:tblBorders>
       </w:tblPr>
       <w:tblGrid>
-        <w:gridCol w:w="1253"/>
-        <w:gridCol w:w="3662"/>
+        <w:gridCol w:w="1446"/>
+        <w:gridCol w:w="3470"/>
         <w:gridCol w:w="2988"/>
-        <w:gridCol w:w="1735"/>
+        <w:gridCol w:w="1734"/>
       </w:tblGrid>
       <w:tr>
         <w:trPr>
@@ -24400,7 +24684,7 @@
         </w:trPr>
         <w:tc>
           <w:tcPr>
-            <w:tcW w:type="dxa" w:w="1253"/>
+            <w:tcW w:type="dxa" w:w="1446"/>
             <w:shd w:fill="11304E" w:color="auto" w:val="clear"/>
             <w:tcMar>
               <w:top w:type="dxa" w:w="90"/>
@@ -24431,7 +24715,7 @@
         </w:tc>
         <w:tc>
           <w:tcPr>
-            <w:tcW w:type="dxa" w:w="3662"/>
+            <w:tcW w:type="dxa" w:w="3470"/>
             <w:shd w:fill="11304E" w:color="auto" w:val="clear"/>
             <w:tcMar>
               <w:top w:type="dxa" w:w="90"/>
@@ -24493,7 +24777,7 @@
         </w:tc>
         <w:tc>
           <w:tcPr>
-            <w:tcW w:type="dxa" w:w="1735"/>
+            <w:tcW w:type="dxa" w:w="1734"/>
             <w:shd w:fill="11304E" w:color="auto" w:val="clear"/>
             <w:tcMar>
               <w:top w:type="dxa" w:w="90"/>
@@ -24529,7 +24813,7 @@
         </w:trPr>
         <w:tc>
           <w:tcPr>
-            <w:tcW w:type="dxa" w:w="1253"/>
+            <w:tcW w:type="dxa" w:w="1446"/>
             <w:tcMar>
               <w:top w:type="dxa" w:w="90"/>
               <w:left w:type="dxa" w:w="130"/>
@@ -24590,7 +24874,7 @@
                 <w:sz w:val="15"/>
                 <w:szCs w:val="15"/>
               </w:rPr>
-              <w:t xml:space="preserve"/>
+              <w:t xml:space="preserve">\nOBL-DP-02</w:t>
             </w:r>
             <w:r>
               <w:rPr>
@@ -24603,26 +24887,13 @@
                 <w:szCs w:val="15"/>
               </w:rPr>
               <w:br/>
-              <w:t xml:space="preserve">OBL-DP-02</w:t>
-            </w:r>
-            <w:r>
-              <w:rPr>
-                <w:b w:val="false"/>
-                <w:bCs w:val="false"/>
-                <w:i w:val="false"/>
-                <w:iCs w:val="false"/>
-                <w:color w:val="0F6E6E"/>
-                <w:sz w:val="15"/>
-                <w:szCs w:val="15"/>
-              </w:rPr>
-              <w:br/>
               <w:t xml:space="preserve">OBL-INS-05</w:t>
             </w:r>
           </w:p>
         </w:tc>
         <w:tc>
           <w:tcPr>
-            <w:tcW w:type="dxa" w:w="3662"/>
+            <w:tcW w:type="dxa" w:w="3470"/>
             <w:tcMar>
               <w:top w:type="dxa" w:w="90"/>
               <w:left w:type="dxa" w:w="130"/>
@@ -24682,7 +24953,7 @@
         </w:tc>
         <w:tc>
           <w:tcPr>
-            <w:tcW w:type="dxa" w:w="1735"/>
+            <w:tcW w:type="dxa" w:w="1734"/>
             <w:tcMar>
               <w:top w:type="dxa" w:w="90"/>
               <w:left w:type="dxa" w:w="130"/>
@@ -24743,7 +25014,7 @@
         </w:trPr>
         <w:tc>
           <w:tcPr>
-            <w:tcW w:type="dxa" w:w="1253"/>
+            <w:tcW w:type="dxa" w:w="1446"/>
             <w:shd w:fill="F1F5F8" w:color="auto" w:val="clear"/>
             <w:tcMar>
               <w:top w:type="dxa" w:w="90"/>
@@ -24837,7 +25108,7 @@
         </w:tc>
         <w:tc>
           <w:tcPr>
-            <w:tcW w:type="dxa" w:w="3662"/>
+            <w:tcW w:type="dxa" w:w="3470"/>
             <w:shd w:fill="F1F5F8" w:color="auto" w:val="clear"/>
             <w:tcMar>
               <w:top w:type="dxa" w:w="90"/>
@@ -24899,7 +25170,7 @@
         </w:tc>
         <w:tc>
           <w:tcPr>
-            <w:tcW w:type="dxa" w:w="1735"/>
+            <w:tcW w:type="dxa" w:w="1734"/>
             <w:shd w:fill="F1F5F8" w:color="auto" w:val="clear"/>
             <w:tcMar>
               <w:top w:type="dxa" w:w="90"/>
@@ -24961,7 +25232,7 @@
         </w:trPr>
         <w:tc>
           <w:tcPr>
-            <w:tcW w:type="dxa" w:w="1253"/>
+            <w:tcW w:type="dxa" w:w="1446"/>
             <w:tcMar>
               <w:top w:type="dxa" w:w="90"/>
               <w:left w:type="dxa" w:w="130"/>
@@ -25022,7 +25293,7 @@
                 <w:sz w:val="15"/>
                 <w:szCs w:val="15"/>
               </w:rPr>
-              <w:t xml:space="preserve"/>
+              <w:t xml:space="preserve">\nOBL-DP-02</w:t>
             </w:r>
             <w:r>
               <w:rPr>
@@ -25035,26 +25306,13 @@
                 <w:szCs w:val="15"/>
               </w:rPr>
               <w:br/>
-              <w:t xml:space="preserve">OBL-DP-02</w:t>
-            </w:r>
-            <w:r>
-              <w:rPr>
-                <w:b w:val="false"/>
-                <w:bCs w:val="false"/>
-                <w:i w:val="false"/>
-                <w:iCs w:val="false"/>
-                <w:color w:val="0F6E6E"/>
-                <w:sz w:val="15"/>
-                <w:szCs w:val="15"/>
-              </w:rPr>
-              <w:br/>
               <w:t xml:space="preserve">OBL-DP-09</w:t>
             </w:r>
           </w:p>
         </w:tc>
         <w:tc>
           <w:tcPr>
-            <w:tcW w:type="dxa" w:w="3662"/>
+            <w:tcW w:type="dxa" w:w="3470"/>
             <w:tcMar>
               <w:top w:type="dxa" w:w="90"/>
               <w:left w:type="dxa" w:w="130"/>
@@ -25114,7 +25372,7 @@
         </w:tc>
         <w:tc>
           <w:tcPr>
-            <w:tcW w:type="dxa" w:w="1735"/>
+            <w:tcW w:type="dxa" w:w="1734"/>
             <w:tcMar>
               <w:top w:type="dxa" w:w="90"/>
               <w:left w:type="dxa" w:w="130"/>
@@ -25175,7 +25433,7 @@
         </w:trPr>
         <w:tc>
           <w:tcPr>
-            <w:tcW w:type="dxa" w:w="1253"/>
+            <w:tcW w:type="dxa" w:w="1446"/>
             <w:shd w:fill="F1F5F8" w:color="auto" w:val="clear"/>
             <w:tcMar>
               <w:top w:type="dxa" w:w="90"/>
@@ -25237,7 +25495,7 @@
                 <w:sz w:val="15"/>
                 <w:szCs w:val="15"/>
               </w:rPr>
-              <w:t xml:space="preserve"/>
+              <w:t xml:space="preserve">\nOBL-DP-02</w:t>
             </w:r>
             <w:r>
               <w:rPr>
@@ -25250,26 +25508,13 @@
                 <w:szCs w:val="15"/>
               </w:rPr>
               <w:br/>
-              <w:t xml:space="preserve">OBL-DP-02</w:t>
-            </w:r>
-            <w:r>
-              <w:rPr>
-                <w:b w:val="false"/>
-                <w:bCs w:val="false"/>
-                <w:i w:val="false"/>
-                <w:iCs w:val="false"/>
-                <w:color w:val="0F6E6E"/>
-                <w:sz w:val="15"/>
-                <w:szCs w:val="15"/>
-              </w:rPr>
-              <w:br/>
               <w:t xml:space="preserve">OBL-DP-09</w:t>
             </w:r>
           </w:p>
         </w:tc>
         <w:tc>
           <w:tcPr>
-            <w:tcW w:type="dxa" w:w="3662"/>
+            <w:tcW w:type="dxa" w:w="3470"/>
             <w:shd w:fill="F1F5F8" w:color="auto" w:val="clear"/>
             <w:tcMar>
               <w:top w:type="dxa" w:w="90"/>
@@ -25331,7 +25576,7 @@
         </w:tc>
         <w:tc>
           <w:tcPr>
-            <w:tcW w:type="dxa" w:w="1735"/>
+            <w:tcW w:type="dxa" w:w="1734"/>
             <w:shd w:fill="F1F5F8" w:color="auto" w:val="clear"/>
             <w:tcMar>
               <w:top w:type="dxa" w:w="90"/>
@@ -25393,7 +25638,7 @@
         </w:trPr>
         <w:tc>
           <w:tcPr>
-            <w:tcW w:type="dxa" w:w="1253"/>
+            <w:tcW w:type="dxa" w:w="1446"/>
             <w:tcMar>
               <w:top w:type="dxa" w:w="90"/>
               <w:left w:type="dxa" w:w="130"/>
@@ -25454,7 +25699,7 @@
                 <w:sz w:val="15"/>
                 <w:szCs w:val="15"/>
               </w:rPr>
-              <w:t xml:space="preserve"/>
+              <w:t xml:space="preserve">\nOBL-DP-02</w:t>
             </w:r>
             <w:r>
               <w:rPr>
@@ -25467,26 +25712,13 @@
                 <w:szCs w:val="15"/>
               </w:rPr>
               <w:br/>
-              <w:t xml:space="preserve">OBL-DP-02</w:t>
-            </w:r>
-            <w:r>
-              <w:rPr>
-                <w:b w:val="false"/>
-                <w:bCs w:val="false"/>
-                <w:i w:val="false"/>
-                <w:iCs w:val="false"/>
-                <w:color w:val="0F6E6E"/>
-                <w:sz w:val="15"/>
-                <w:szCs w:val="15"/>
-              </w:rPr>
-              <w:br/>
               <w:t xml:space="preserve">OBL-DP-09</w:t>
             </w:r>
           </w:p>
         </w:tc>
         <w:tc>
           <w:tcPr>
-            <w:tcW w:type="dxa" w:w="3662"/>
+            <w:tcW w:type="dxa" w:w="3470"/>
             <w:tcMar>
               <w:top w:type="dxa" w:w="90"/>
               <w:left w:type="dxa" w:w="130"/>
@@ -25546,7 +25778,7 @@
         </w:tc>
         <w:tc>
           <w:tcPr>
-            <w:tcW w:type="dxa" w:w="1735"/>
+            <w:tcW w:type="dxa" w:w="1734"/>
             <w:tcMar>
               <w:top w:type="dxa" w:w="90"/>
               <w:left w:type="dxa" w:w="130"/>
@@ -25607,7 +25839,7 @@
         </w:trPr>
         <w:tc>
           <w:tcPr>
-            <w:tcW w:type="dxa" w:w="1253"/>
+            <w:tcW w:type="dxa" w:w="1446"/>
             <w:shd w:fill="F1F5F8" w:color="auto" w:val="clear"/>
             <w:tcMar>
               <w:top w:type="dxa" w:w="90"/>
@@ -25669,7 +25901,7 @@
                 <w:sz w:val="15"/>
                 <w:szCs w:val="15"/>
               </w:rPr>
-              <w:t xml:space="preserve"/>
+              <w:t xml:space="preserve">\nOBL-DP-01</w:t>
             </w:r>
             <w:r>
               <w:rPr>
@@ -25682,26 +25914,13 @@
                 <w:szCs w:val="15"/>
               </w:rPr>
               <w:br/>
-              <w:t xml:space="preserve">OBL-DP-01</w:t>
-            </w:r>
-            <w:r>
-              <w:rPr>
-                <w:b w:val="false"/>
-                <w:bCs w:val="false"/>
-                <w:i w:val="false"/>
-                <w:iCs w:val="false"/>
-                <w:color w:val="0F6E6E"/>
-                <w:sz w:val="15"/>
-                <w:szCs w:val="15"/>
-              </w:rPr>
-              <w:br/>
               <w:t xml:space="preserve">OBL-DP-02</w:t>
             </w:r>
           </w:p>
         </w:tc>
         <w:tc>
           <w:tcPr>
-            <w:tcW w:type="dxa" w:w="3662"/>
+            <w:tcW w:type="dxa" w:w="3470"/>
             <w:shd w:fill="F1F5F8" w:color="auto" w:val="clear"/>
             <w:tcMar>
               <w:top w:type="dxa" w:w="90"/>
@@ -25763,7 +25982,7 @@
         </w:tc>
         <w:tc>
           <w:tcPr>
-            <w:tcW w:type="dxa" w:w="1735"/>
+            <w:tcW w:type="dxa" w:w="1734"/>
             <w:shd w:fill="F1F5F8" w:color="auto" w:val="clear"/>
             <w:tcMar>
               <w:top w:type="dxa" w:w="90"/>
@@ -26887,7 +27106,7 @@
                 <w:sz w:val="18"/>
                 <w:szCs w:val="18"/>
               </w:rPr>
-              <w:t xml:space="preserve">CNS-R33 – R36, SUIT-R24</w:t>
+              <w:t xml:space="preserve">CNS-R33 – R36, SUIT-R24 – R24a</w:t>
             </w:r>
           </w:p>
         </w:tc>
@@ -27622,113 +27841,6 @@
                 <w:szCs w:val="18"/>
               </w:rPr>
               <w:t xml:space="preserve">Pending</w:t>
-            </w:r>
-          </w:p>
-        </w:tc>
-      </w:tr>
-      <w:tr>
-        <w:trPr>
-          <w:cantSplit/>
-        </w:trPr>
-        <w:tc>
-          <w:tcPr>
-            <w:tcW w:type="dxa" w:w="2313"/>
-            <w:tcMar>
-              <w:top w:type="dxa" w:w="90"/>
-              <w:left w:type="dxa" w:w="130"/>
-              <w:bottom w:type="dxa" w:w="90"/>
-              <w:right w:type="dxa" w:w="130"/>
-            </w:tcMar>
-            <w:vAlign w:val="top"/>
-          </w:tcPr>
-          <w:p>
-            <w:pPr>
-              <w:spacing w:after="40" w:before="40" w:line="252"/>
-              <w:jc w:val="left"/>
-            </w:pPr>
-            <w:r>
-              <w:rPr>
-                <w:b w:val="false"/>
-                <w:bCs w:val="false"/>
-                <w:i w:val="false"/>
-                <w:iCs w:val="false"/>
-                <w:color w:val="222629"/>
-                <w:sz w:val="18"/>
-                <w:szCs w:val="18"/>
-              </w:rPr>
-              <w:t xml:space="preserve">Operations</w:t>
-            </w:r>
-          </w:p>
-        </w:tc>
-        <w:tc>
-          <w:tcPr>
-            <w:tcW w:type="dxa" w:w="5590"/>
-            <w:tcMar>
-              <w:top w:type="dxa" w:w="90"/>
-              <w:left w:type="dxa" w:w="130"/>
-              <w:bottom w:type="dxa" w:w="90"/>
-              <w:right w:type="dxa" w:w="130"/>
-            </w:tcMar>
-            <w:vAlign w:val="top"/>
-          </w:tcPr>
-          <w:p>
-            <w:pPr>
-              <w:spacing w:after="40" w:before="40" w:line="252"/>
-              <w:jc w:val="left"/>
-            </w:pPr>
-            <w:r>
-              <w:rPr>
-                <w:b w:val="false"/>
-                <w:bCs w:val="false"/>
-                <w:i w:val="false"/>
-                <w:iCs w:val="false"/>
-                <w:color w:val="222629"/>
-                <w:sz w:val="18"/>
-                <w:szCs w:val="18"/>
-              </w:rPr>
-              <w:t xml:space="preserve">Whether the operational load these rules create can actually be carried: retrieval service levels, the tasks raised by post-submission withdrawal and by replacement cases, the stopped-submission path, and the handling of in-flight journeys when the assessment service is unavailable</w:t>
-            </w:r>
-          </w:p>
-        </w:tc>
-        <w:tc>
-          <w:tcPr>
-            <w:tcW w:type="dxa" w:w="1735"/>
-            <w:tcMar>
-              <w:top w:type="dxa" w:w="90"/>
-              <w:left w:type="dxa" w:w="130"/>
-              <w:bottom w:type="dxa" w:w="90"/>
-              <w:right w:type="dxa" w:w="130"/>
-            </w:tcMar>
-            <w:vAlign w:val="top"/>
-          </w:tcPr>
-          <w:p>
-            <w:pPr>
-              <w:spacing w:after="40" w:before="40" w:line="252"/>
-              <w:jc w:val="left"/>
-            </w:pPr>
-            <w:r>
-              <w:rPr>
-                <w:b/>
-                <w:bCs/>
-                <w:i w:val="false"/>
-                <w:iCs w:val="false"/>
-                <w:color w:val="8A5A00"/>
-                <w:sz w:val="18"/>
-                <w:szCs w:val="18"/>
-              </w:rPr>
-              <w:t xml:space="preserve">Pending — added at v1.1</w:t>
-            </w:r>
-            <w:r>
-              <w:rPr>
-                <w:b w:val="false"/>
-                <w:bCs w:val="false"/>
-                <w:i w:val="false"/>
-                <w:iCs w:val="false"/>
-                <w:color w:val="222629"/>
-                <w:sz w:val="18"/>
-                <w:szCs w:val="18"/>
-              </w:rPr>
-              <w:t xml:space="preserve">, after review found that fail-closed behaviour, retrieval commitments and operational tasks were all material and no Operations conclusion had been sought</w:t>
             </w:r>
           </w:p>
         </w:tc>
@@ -29061,7 +29173,7 @@
                 <w:sz w:val="18"/>
                 <w:szCs w:val="18"/>
               </w:rPr>
-              <w:t xml:space="preserve">Regulatory permissibility of both rule packs; the basis for statement and disclosure wording; the sequencing of consent within the journey; the retention basis; the ten open determinations in §10; and the consent-consolidation proposal in §11, including OPEN-CNS-06 and OPEN-CNS-07.</w:t>
+              <w:t xml:space="preserve">Regulatory permissibility of both rule packs; the basis for statement and disclosure wording; the sequencing of consent within the journey; the retention basis; the twelve open determinations in §10; and the consent-consolidation proposal in §11, including OPEN-CNS-06 and OPEN-CNS-07.</w:t>
             </w:r>
           </w:p>
         </w:tc>
@@ -39294,7 +39406,7 @@
           <w:sz w:val="17"/>
           <w:szCs w:val="17"/>
         </w:rPr>
-        <w:t xml:space="preserve">Volume 1 of 3 — Decision Pack · Prepared for the Principal Insurance Platform Product Owner · AU Bank Insurance Distribution Platform · 17 August 2026 · Approval reference COMP-APPROVE-CNS-SUIT-v1.1</w:t>
+        <w:t xml:space="preserve">Volume 1 of 3 — Decision Pack · AI-drafted for Product and Compliance review — unsigned · AU Bank Insurance Distribution Platform · 17 August 2026 · Approval reference COMP-APPROVE-CNS-SUIT-v1.1</w:t>
       </w:r>
     </w:p>
     <w:sectPr>

</xml_diff>